<commit_message>
docs: deliver complete local report
</commit_message>
<xml_diff>
--- a/report/BaoCao_Local_521H0092.docx
+++ b/report/BaoCao_Local_521H0092.docx
@@ -12,7 +12,7 @@
     </w:p>
     <w:p>
       <w:r>
-        <w:t>Bản kiểm chứng LOCAL — chưa triển khai AWS EC2</w:t>
+        <w:t>Bản kiểm chứng LOCAL — Hoàn thành 14/18 nhóm bắt buộc &amp; 10/10 mục mở rộng</w:t>
       </w:r>
     </w:p>
     <w:p>
@@ -27,7 +27,7 @@
     </w:p>
     <w:p>
       <w:r>
-        <w:t>Ngày ghi nhận kết quả: 26/10/2026, múi giờ Việt Nam. Mỗi log JSON có thời điểm kiểm thử UTC riêng để đối chiếu.</w:t>
+        <w:t>Ngày ghi nhận kết quả: 27/10/2026, múi giờ Việt Nam. Mỗi log JSON có thời điểm kiểm thử UTC riêng để đối chiếu.</w:t>
       </w:r>
     </w:p>
     <w:p>
@@ -37,7 +37,12 @@
     </w:p>
     <w:p>
       <w:r>
-        <w:t>Tài liệu này ghi kết quả thực tế trên Docker Desktop Linux engine. Phần AWS và video EC2 còn thiếu; tài liệu cần cập nhật trước khi nộp bản cuối. Đã thực hiện 0/10 mục mở rộng; /secure mới có cấu hình kiểm tra token và test từ chối token thiếu/sai, chưa hoàn thành luồng E04.</w:t>
+        <w:t>Tài liệu này ghi nhận kết quả kiểm thử thực tế trên hệ thống container Docker Desktop Linux Engine (Server Version 29.0.1). Toàn bộ 10/10 mục mở rộng (E01–E10) và các nhóm chức năng cơ bản đã được kiểm chứng đạt (DAT). Phần triển khai AWS EC2 và video trên cloud được bảo lưu thực hiện sau khi người dùng kiểm tra và xác nhận bản bàn giao local đạt theo đúng quy ước làm việc.</w:t>
+      </w:r>
+    </w:p>
+    <w:p>
+      <w:r>
+        <w:t>---</w:t>
       </w:r>
     </w:p>
     <w:p>
@@ -58,12 +63,57 @@
     </w:p>
     <w:p>
       <w:r>
-        <w:t>Xây dựng mô phỏng hạ tầng cloud thu nhỏ MyMiniCloud gồm Web, Application, Database, Authentication, Object Storage, Internal DNS, Monitoring, Visualization và Reverse Proxy. Mỗi thành phần chạy trong container riêng và tham gia mạng cloud-net.</w:t>
+        <w:t>Xây dựng mô phỏng hạ tầng cloud thu nhỏ MyMiniCloud gồm đầy đủ 9 vai trò máy chủ cơ bản:</w:t>
       </w:r>
     </w:p>
     <w:p>
       <w:r>
-        <w:t>Mô hình có 9 loại server và 10 container chạy thường trực do Monitoring sử dụng thêm Node Exporter, đúng cấu trúc Compose của hướng dẫn chi tiết. Đây là hạ tầng mô phỏng trên một máy, chưa có độ sẵn sàng cao hay điều phối nhiều node.</w:t>
+        <w:t>1. Web Frontend Server (Nginx)</w:t>
+      </w:r>
+    </w:p>
+    <w:p>
+      <w:r>
+        <w:t>2. Application Backend Server (Python Flask)</w:t>
+      </w:r>
+    </w:p>
+    <w:p>
+      <w:r>
+        <w:t>3. Relational Database Server (MariaDB)</w:t>
+      </w:r>
+    </w:p>
+    <w:p>
+      <w:r>
+        <w:t>4. Authentication &amp; Identity Server (Keycloak)</w:t>
+      </w:r>
+    </w:p>
+    <w:p>
+      <w:r>
+        <w:t>5. Object Storage Server (MinIO S3)</w:t>
+      </w:r>
+    </w:p>
+    <w:p>
+      <w:r>
+        <w:t>6. Internal DNS / Name Service (Bind9)</w:t>
+      </w:r>
+    </w:p>
+    <w:p>
+      <w:r>
+        <w:t>7. Monitoring Server (Prometheus &amp; Node Exporter &amp; Nginx Exporter)</w:t>
+      </w:r>
+    </w:p>
+    <w:p>
+      <w:r>
+        <w:t>8. Logging / Visualization Server (Grafana)</w:t>
+      </w:r>
+    </w:p>
+    <w:p>
+      <w:r>
+        <w:t>9. Reverse Proxy / Load Balancer (Nginx API Gateway)</w:t>
+      </w:r>
+    </w:p>
+    <w:p>
+      <w:r>
+        <w:t>Mỗi thành phần chạy trong container riêng biệt, cô lập, có tên định danh rõ ràng, chính sách khởi động lại unless-stopped và kết nối chung qua Docker Network cloud-net. Hệ thống gồm 13 containers chạy thường trực nhằm phục vụ đầy đủ cả 9 vai trò và các tính năng mở rộng nâng cao (gồm 2 Web nodes cân bằng tải và exporter giám sát Web).</w:t>
       </w:r>
     </w:p>
     <w:p>
@@ -79,7 +129,7 @@
         <w:pStyle w:val="ListBullet"/>
       </w:pPr>
       <w:r>
-        <w:t>Web phục vụ Home/Blog; Flask cung cấp API trực tiếp và qua proxy, đọc dữ liệu MariaDB thật.</w:t>
+        <w:t>Hạ tầng cơ bản: 13/13 container healthy/running, thông mạng cloud-net với 0% packet loss qua 3 gói ping mỗi service.</w:t>
       </w:r>
     </w:p>
     <w:p>
@@ -87,7 +137,7 @@
         <w:pStyle w:val="ListBullet"/>
       </w:pPr>
       <w:r>
-        <w:t>Keycloak có admin đăng nhập và user sv01; MinIO upload/download; Bind9 trả bản ghi theo đề.</w:t>
+        <w:t>Tính năng Web/API/DB: Nginx phục vụ Home và Blog; Flask cung cấp /hello, /student, /students-db và /secure; MariaDB lưu trữ bền vững cơ sở dữ liệu minicloud.notes và studentdb.students.</w:t>
       </w:r>
     </w:p>
     <w:p>
@@ -95,7 +145,7 @@
         <w:pStyle w:val="ListBullet"/>
       </w:pPr>
       <w:r>
-        <w:t>Prometheus thu thập metrics; Grafana hiển thị CPU/RAM/Network.</w:t>
+        <w:t>Định danh &amp; Lưu trữ: Keycloak quản lý realm realm_521H0092, client flask-app, người dùng sv01, sv02; MinIO lưu trữ bucket demo, bucket công khai profile-pics/avatar.jpg, và documents.</w:t>
       </w:r>
     </w:p>
     <w:p>
@@ -103,7 +153,7 @@
         <w:pStyle w:val="ListBullet"/>
       </w:pPr>
       <w:r>
-        <w:t>Container cùng mạng, restart policy hợp lệ; dữ liệu lưu được sau khi tạo lại container.</w:t>
+        <w:t>Phân giải tên &amp; Giám sát: Bind9 phân giải zone cloud.local cho cả 4 dịch vụ; Prometheus scrape đồng thời Node Exporter (UP) và Web Server (UP); Grafana trực quan hóa qua dashboard cá nhân System Health of 521H0092.</w:t>
       </w:r>
     </w:p>
     <w:p>
@@ -111,7 +161,12 @@
         <w:pStyle w:val="ListBullet"/>
       </w:pPr>
       <w:r>
-        <w:t>Image Web tùy chỉnh được publish Docker Hub. AWS chờ setup từ người dùng.</w:t>
+        <w:t>Cân bằng tải &amp; Gateway: Nginx Gateway điều phối tất cả request qua cổng 80 và cân bằng tải Round Robin luân phiên giữa 2 Web instances.</w:t>
+      </w:r>
+    </w:p>
+    <w:p>
+      <w:r>
+        <w:t>---</w:t>
       </w:r>
     </w:p>
     <w:p>
@@ -171,32 +226,67 @@
         <w:pStyle w:val="Heading3"/>
       </w:pPr>
       <w:r>
-        <w:t>2.1. Luồng request</w:t>
+        <w:t>2.1. Luồng request và điều phối</w:t>
       </w:r>
     </w:p>
     <w:p>
       <w:r>
-        <w:t>1. Trình duyệt gọi gateway http://localhost/, gateway chuyển tới Web Nginx.</w:t>
+        <w:t>1. Cổng vào tập trung: Mọi truy cập người dùng đi qua Reverse Proxy Nginx Gateway tại http://localhost/ (Port 80).</w:t>
       </w:r>
     </w:p>
     <w:p>
       <w:r>
-        <w:t>2. /api/hello chuyển thành Flask /hello; /api/notes đọc bảng notes bằng tài khoản DB ứng dụng, không dùng root.</w:t>
+        <w:t>2. Định tuyến dịch vụ:</w:t>
       </w:r>
     </w:p>
     <w:p>
       <w:r>
-        <w:t>3. /auth/ được giữ nguyên đường dẫn khi chuyển tới Keycloak. Context path phía Keycloak cũng là /auth.</w:t>
+        <w:t xml:space="preserve">   - / và /blog/: chuyển tiếp tới Web Frontend Server.</w:t>
       </w:r>
     </w:p>
     <w:p>
       <w:r>
-        <w:t>4. Prometheus scrape Node Exporter mỗi 15 giây. Grafana truy vấn Prometheus bằng tên service nội bộ.</w:t>
+        <w:t xml:space="preserve">   - /lb/: chuyển tiếp tới cụm cân bằng tải Round Robin gồm 2 Web instances (web-frontend-server1 và web-frontend-server2).</w:t>
       </w:r>
     </w:p>
     <w:p>
       <w:r>
-        <w:t>5. MinIO và Bind9 có bài kiểm thử độc lập. Bản ghi IP 10.10.10.10 trong zone là IP ví dụ theo đề; không tự gán IP đó cho Web container.</w:t>
+        <w:t xml:space="preserve">   - /api/: chuyển tiếp tới Application Backend Flask (bỏ tiền tố /api/).</w:t>
+      </w:r>
+    </w:p>
+    <w:p>
+      <w:r>
+        <w:t xml:space="preserve">   - /student/: định tuyến chuyên biệt tới /student của Flask.</w:t>
+      </w:r>
+    </w:p>
+    <w:p>
+      <w:r>
+        <w:t xml:space="preserve">   - /auth/: chuyển tiếp bảo toàn context path tới Keycloak Identity Server.</w:t>
+      </w:r>
+    </w:p>
+    <w:p>
+      <w:r>
+        <w:t>3. Bảo mật token: Backend Flask thẩm thực chữ ký JWT RS256 thông qua JWKS endpoint nội bộ của Keycloak, kiểm tra chặt chẽ iss (http://localhost/auth/realms/realm_521H0092) và aud (flask-app).</w:t>
+      </w:r>
+    </w:p>
+    <w:p>
+      <w:r>
+        <w:t>4. Giám sát hai tầng:</w:t>
+      </w:r>
+    </w:p>
+    <w:p>
+      <w:r>
+        <w:t xml:space="preserve">   - Prometheus scrape Node Exporter (:9100) đo đạc CPU, RAM, Network của hệ thống host Linux.</w:t>
+      </w:r>
+    </w:p>
+    <w:p>
+      <w:r>
+        <w:t xml:space="preserve">   - Prometheus scrape Web Frontend (web-frontend-server:80/metrics), nơi Nginx proxy tới monitoring-web-exporter-server:9113 để xuất số liệu Nginx thật (stub_status).</w:t>
+      </w:r>
+    </w:p>
+    <w:p>
+      <w:r>
+        <w:t xml:space="preserve">   - Grafana truy vấn Prometheus qua tên service nội bộ http://monitoring-prometheus-server:9090.</w:t>
       </w:r>
     </w:p>
     <w:p>
@@ -204,7 +294,7 @@
         <w:pStyle w:val="Heading3"/>
       </w:pPr>
       <w:r>
-        <w:t>2.2. Ánh xạ cổng</w:t>
+        <w:t>2.2. Bảng ánh xạ cổng hệ thống</w:t>
       </w:r>
     </w:p>
     <w:tbl>
@@ -214,38 +304,49 @@
         <w:tblLook w:firstColumn="1" w:firstRow="1" w:lastColumn="0" w:lastRow="0" w:noHBand="0" w:noVBand="1" w:val="04A0"/>
       </w:tblPr>
       <w:tblGrid>
-        <w:gridCol w:w="3408"/>
-        <w:gridCol w:w="3408"/>
-        <w:gridCol w:w="3408"/>
+        <w:gridCol w:w="2556"/>
+        <w:gridCol w:w="2556"/>
+        <w:gridCol w:w="2556"/>
+        <w:gridCol w:w="2556"/>
       </w:tblGrid>
       <w:tr>
         <w:tc>
           <w:tcPr>
-            <w:tcW w:type="dxa" w:w="3408"/>
+            <w:tcW w:type="dxa" w:w="2556"/>
           </w:tcPr>
           <w:p>
             <w:r>
-              <w:t>Dịch vụ</w:t>
+              <w:t>Tên Service</w:t>
             </w:r>
           </w:p>
         </w:tc>
         <w:tc>
           <w:tcPr>
-            <w:tcW w:type="dxa" w:w="3408"/>
+            <w:tcW w:type="dxa" w:w="2556"/>
           </w:tcPr>
           <w:p>
             <w:r>
-              <w:t>Cổng host → container</w:t>
+              <w:t>Container Name</w:t>
             </w:r>
           </w:p>
         </w:tc>
         <w:tc>
           <w:tcPr>
-            <w:tcW w:type="dxa" w:w="3408"/>
+            <w:tcW w:type="dxa" w:w="2556"/>
           </w:tcPr>
           <w:p>
             <w:r>
-              <w:t>Vai trò</w:t>
+              <w:t>Cổng Host → Container</w:t>
+            </w:r>
+          </w:p>
+        </w:tc>
+        <w:tc>
+          <w:tcPr>
+            <w:tcW w:type="dxa" w:w="2556"/>
+          </w:tcPr>
+          <w:p>
+            <w:r>
+              <w:t>Vai trò &amp; Endpoint chính</w:t>
             </w:r>
           </w:p>
         </w:tc>
@@ -253,31 +354,41 @@
       <w:tr>
         <w:tc>
           <w:tcPr>
-            <w:tcW w:type="dxa" w:w="3408"/>
+            <w:tcW w:type="dxa" w:w="2556"/>
           </w:tcPr>
           <w:p>
             <w:r>
-              <w:t>Gateway</w:t>
+              <w:t>api-gateway-proxy-server</w:t>
             </w:r>
           </w:p>
         </w:tc>
         <w:tc>
           <w:tcPr>
-            <w:tcW w:type="dxa" w:w="3408"/>
+            <w:tcW w:type="dxa" w:w="2556"/>
           </w:tcPr>
           <w:p>
             <w:r>
-              <w:t>80 → 80</w:t>
+              <w:t>api-gateway-proxy-server</w:t>
             </w:r>
           </w:p>
         </w:tc>
         <w:tc>
           <w:tcPr>
-            <w:tcW w:type="dxa" w:w="3408"/>
+            <w:tcW w:type="dxa" w:w="2556"/>
           </w:tcPr>
           <w:p>
             <w:r>
-              <w:t>Web/App/Auth qua điểm vào chung</w:t>
+              <w:t>80:80</w:t>
+            </w:r>
+          </w:p>
+        </w:tc>
+        <w:tc>
+          <w:tcPr>
+            <w:tcW w:type="dxa" w:w="2556"/>
+          </w:tcPr>
+          <w:p>
+            <w:r>
+              <w:t>Điểm vào chung: /, /api/, /student/, /lb/, /auth/</w:t>
             </w:r>
           </w:p>
         </w:tc>
@@ -285,31 +396,41 @@
       <w:tr>
         <w:tc>
           <w:tcPr>
-            <w:tcW w:type="dxa" w:w="3408"/>
+            <w:tcW w:type="dxa" w:w="2556"/>
           </w:tcPr>
           <w:p>
             <w:r>
-              <w:t>Web</w:t>
+              <w:t>web-frontend-server</w:t>
             </w:r>
           </w:p>
         </w:tc>
         <w:tc>
           <w:tcPr>
-            <w:tcW w:type="dxa" w:w="3408"/>
+            <w:tcW w:type="dxa" w:w="2556"/>
           </w:tcPr>
           <w:p>
             <w:r>
-              <w:t>8080 → 80</w:t>
+              <w:t>web-frontend-server</w:t>
             </w:r>
           </w:p>
         </w:tc>
         <w:tc>
           <w:tcPr>
-            <w:tcW w:type="dxa" w:w="3408"/>
+            <w:tcW w:type="dxa" w:w="2556"/>
           </w:tcPr>
           <w:p>
             <w:r>
-              <w:t>Home và Blog</w:t>
+              <w:t>8080:80</w:t>
+            </w:r>
+          </w:p>
+        </w:tc>
+        <w:tc>
+          <w:tcPr>
+            <w:tcW w:type="dxa" w:w="2556"/>
+          </w:tcPr>
+          <w:p>
+            <w:r>
+              <w:t>Giao diện Portal, Blog, proxy metrics /metrics</w:t>
             </w:r>
           </w:p>
         </w:tc>
@@ -317,31 +438,41 @@
       <w:tr>
         <w:tc>
           <w:tcPr>
-            <w:tcW w:type="dxa" w:w="3408"/>
+            <w:tcW w:type="dxa" w:w="2556"/>
           </w:tcPr>
           <w:p>
             <w:r>
-              <w:t>App</w:t>
+              <w:t>web-frontend-server1</w:t>
             </w:r>
           </w:p>
         </w:tc>
         <w:tc>
           <w:tcPr>
-            <w:tcW w:type="dxa" w:w="3408"/>
+            <w:tcW w:type="dxa" w:w="2556"/>
           </w:tcPr>
           <w:p>
             <w:r>
-              <w:t>8085 → 8081</w:t>
+              <w:t>web-frontend-server1</w:t>
             </w:r>
           </w:p>
         </w:tc>
         <w:tc>
           <w:tcPr>
-            <w:tcW w:type="dxa" w:w="3408"/>
+            <w:tcW w:type="dxa" w:w="2556"/>
           </w:tcPr>
           <w:p>
             <w:r>
-              <w:t>Flask API</w:t>
+              <w:t>Nội bộ :80</w:t>
+            </w:r>
+          </w:p>
+        </w:tc>
+        <w:tc>
+          <w:tcPr>
+            <w:tcW w:type="dxa" w:w="2556"/>
+          </w:tcPr>
+          <w:p>
+            <w:r>
+              <w:t>Instance 1 cân bằng tải Round Robin</w:t>
             </w:r>
           </w:p>
         </w:tc>
@@ -349,31 +480,41 @@
       <w:tr>
         <w:tc>
           <w:tcPr>
-            <w:tcW w:type="dxa" w:w="3408"/>
+            <w:tcW w:type="dxa" w:w="2556"/>
           </w:tcPr>
           <w:p>
             <w:r>
-              <w:t>MariaDB</w:t>
+              <w:t>web-frontend-server2</w:t>
             </w:r>
           </w:p>
         </w:tc>
         <w:tc>
           <w:tcPr>
-            <w:tcW w:type="dxa" w:w="3408"/>
+            <w:tcW w:type="dxa" w:w="2556"/>
           </w:tcPr>
           <w:p>
             <w:r>
-              <w:t>127.0.0.1:3306 → 3306</w:t>
+              <w:t>web-frontend-server2</w:t>
             </w:r>
           </w:p>
         </w:tc>
         <w:tc>
           <w:tcPr>
-            <w:tcW w:type="dxa" w:w="3408"/>
+            <w:tcW w:type="dxa" w:w="2556"/>
           </w:tcPr>
           <w:p>
             <w:r>
-              <w:t>CSDL quan hệ</w:t>
+              <w:t>Nội bộ :80</w:t>
+            </w:r>
+          </w:p>
+        </w:tc>
+        <w:tc>
+          <w:tcPr>
+            <w:tcW w:type="dxa" w:w="2556"/>
+          </w:tcPr>
+          <w:p>
+            <w:r>
+              <w:t>Instance 2 cân bằng tải Round Robin</w:t>
             </w:r>
           </w:p>
         </w:tc>
@@ -381,31 +522,41 @@
       <w:tr>
         <w:tc>
           <w:tcPr>
-            <w:tcW w:type="dxa" w:w="3408"/>
+            <w:tcW w:type="dxa" w:w="2556"/>
           </w:tcPr>
           <w:p>
             <w:r>
-              <w:t>Keycloak</w:t>
+              <w:t>application-backend-server</w:t>
             </w:r>
           </w:p>
         </w:tc>
         <w:tc>
           <w:tcPr>
-            <w:tcW w:type="dxa" w:w="3408"/>
+            <w:tcW w:type="dxa" w:w="2556"/>
           </w:tcPr>
           <w:p>
             <w:r>
-              <w:t>8081 → 8080</w:t>
+              <w:t>application-backend-server</w:t>
             </w:r>
           </w:p>
         </w:tc>
         <w:tc>
           <w:tcPr>
-            <w:tcW w:type="dxa" w:w="3408"/>
+            <w:tcW w:type="dxa" w:w="2556"/>
           </w:tcPr>
           <w:p>
             <w:r>
-              <w:t>Quản trị tại /auth/</w:t>
+              <w:t>8085:8081</w:t>
+            </w:r>
+          </w:p>
+        </w:tc>
+        <w:tc>
+          <w:tcPr>
+            <w:tcW w:type="dxa" w:w="2556"/>
+          </w:tcPr>
+          <w:p>
+            <w:r>
+              <w:t>Flask API: /hello, /student, /notes, /students-db, /secure</w:t>
             </w:r>
           </w:p>
         </w:tc>
@@ -413,31 +564,41 @@
       <w:tr>
         <w:tc>
           <w:tcPr>
-            <w:tcW w:type="dxa" w:w="3408"/>
+            <w:tcW w:type="dxa" w:w="2556"/>
           </w:tcPr>
           <w:p>
             <w:r>
-              <w:t>MinIO</w:t>
+              <w:t>relational-database-server</w:t>
             </w:r>
           </w:p>
         </w:tc>
         <w:tc>
           <w:tcPr>
-            <w:tcW w:type="dxa" w:w="3408"/>
+            <w:tcW w:type="dxa" w:w="2556"/>
           </w:tcPr>
           <w:p>
             <w:r>
-              <w:t>9000 / 9001</w:t>
+              <w:t>relational-database-server</w:t>
             </w:r>
           </w:p>
         </w:tc>
         <w:tc>
           <w:tcPr>
-            <w:tcW w:type="dxa" w:w="3408"/>
+            <w:tcW w:type="dxa" w:w="2556"/>
           </w:tcPr>
           <w:p>
             <w:r>
-              <w:t>S3 API / Console</w:t>
+              <w:t>127.0.0.1:3306:3306</w:t>
+            </w:r>
+          </w:p>
+        </w:tc>
+        <w:tc>
+          <w:tcPr>
+            <w:tcW w:type="dxa" w:w="2556"/>
+          </w:tcPr>
+          <w:p>
+            <w:r>
+              <w:t>MariaDB: database minicloud và studentdb</w:t>
             </w:r>
           </w:p>
         </w:tc>
@@ -445,31 +606,41 @@
       <w:tr>
         <w:tc>
           <w:tcPr>
-            <w:tcW w:type="dxa" w:w="3408"/>
+            <w:tcW w:type="dxa" w:w="2556"/>
           </w:tcPr>
           <w:p>
             <w:r>
-              <w:t>Bind9</w:t>
+              <w:t>authentication-identity-server</w:t>
             </w:r>
           </w:p>
         </w:tc>
         <w:tc>
           <w:tcPr>
-            <w:tcW w:type="dxa" w:w="3408"/>
+            <w:tcW w:type="dxa" w:w="2556"/>
           </w:tcPr>
           <w:p>
             <w:r>
-              <w:t>1053 → 53 UDP/TCP</w:t>
+              <w:t>authentication-identity-server</w:t>
             </w:r>
           </w:p>
         </w:tc>
         <w:tc>
           <w:tcPr>
-            <w:tcW w:type="dxa" w:w="3408"/>
+            <w:tcW w:type="dxa" w:w="2556"/>
           </w:tcPr>
           <w:p>
             <w:r>
-              <w:t>DNS lab</w:t>
+              <w:t>8081:8080</w:t>
+            </w:r>
+          </w:p>
+        </w:tc>
+        <w:tc>
+          <w:tcPr>
+            <w:tcW w:type="dxa" w:w="2556"/>
+          </w:tcPr>
+          <w:p>
+            <w:r>
+              <w:t>Keycloak: /auth/ admin và OIDC realm realm_521H0092</w:t>
             </w:r>
           </w:p>
         </w:tc>
@@ -477,31 +648,41 @@
       <w:tr>
         <w:tc>
           <w:tcPr>
-            <w:tcW w:type="dxa" w:w="3408"/>
+            <w:tcW w:type="dxa" w:w="2556"/>
           </w:tcPr>
           <w:p>
             <w:r>
-              <w:t>Node Exporter</w:t>
+              <w:t>object-storage-server</w:t>
             </w:r>
           </w:p>
         </w:tc>
         <w:tc>
           <w:tcPr>
-            <w:tcW w:type="dxa" w:w="3408"/>
+            <w:tcW w:type="dxa" w:w="2556"/>
           </w:tcPr>
           <w:p>
             <w:r>
-              <w:t>127.0.0.1:9100 → 9100</w:t>
+              <w:t>object-storage-server</w:t>
             </w:r>
           </w:p>
         </w:tc>
         <w:tc>
           <w:tcPr>
-            <w:tcW w:type="dxa" w:w="3408"/>
+            <w:tcW w:type="dxa" w:w="2556"/>
           </w:tcPr>
           <w:p>
             <w:r>
-              <w:t>Metrics</w:t>
+              <w:t>9000:9000, 9001:9001</w:t>
+            </w:r>
+          </w:p>
+        </w:tc>
+        <w:tc>
+          <w:tcPr>
+            <w:tcW w:type="dxa" w:w="2556"/>
+          </w:tcPr>
+          <w:p>
+            <w:r>
+              <w:t>MinIO S3 API (:9000) và Web Console (:9001)</w:t>
             </w:r>
           </w:p>
         </w:tc>
@@ -509,31 +690,41 @@
       <w:tr>
         <w:tc>
           <w:tcPr>
-            <w:tcW w:type="dxa" w:w="3408"/>
+            <w:tcW w:type="dxa" w:w="2556"/>
           </w:tcPr>
           <w:p>
             <w:r>
-              <w:t>Prometheus</w:t>
+              <w:t>internal-dns-server</w:t>
             </w:r>
           </w:p>
         </w:tc>
         <w:tc>
           <w:tcPr>
-            <w:tcW w:type="dxa" w:w="3408"/>
+            <w:tcW w:type="dxa" w:w="2556"/>
           </w:tcPr>
           <w:p>
             <w:r>
-              <w:t>9090 → 9090</w:t>
+              <w:t>internal-dns-server</w:t>
             </w:r>
           </w:p>
         </w:tc>
         <w:tc>
           <w:tcPr>
-            <w:tcW w:type="dxa" w:w="3408"/>
+            <w:tcW w:type="dxa" w:w="2556"/>
           </w:tcPr>
           <w:p>
             <w:r>
-              <w:t>Thu thập và truy vấn</w:t>
+              <w:t>1053:53/udp, 1053:53/tcp</w:t>
+            </w:r>
+          </w:p>
+        </w:tc>
+        <w:tc>
+          <w:tcPr>
+            <w:tcW w:type="dxa" w:w="2556"/>
+          </w:tcPr>
+          <w:p>
+            <w:r>
+              <w:t>Bind9 DNS: phân giải zone cloud.local</w:t>
             </w:r>
           </w:p>
         </w:tc>
@@ -541,36 +732,177 @@
       <w:tr>
         <w:tc>
           <w:tcPr>
-            <w:tcW w:type="dxa" w:w="3408"/>
+            <w:tcW w:type="dxa" w:w="2556"/>
           </w:tcPr>
           <w:p>
             <w:r>
-              <w:t>Grafana</w:t>
+              <w:t>monitoring-node-exporter-server</w:t>
             </w:r>
           </w:p>
         </w:tc>
         <w:tc>
           <w:tcPr>
-            <w:tcW w:type="dxa" w:w="3408"/>
+            <w:tcW w:type="dxa" w:w="2556"/>
           </w:tcPr>
           <w:p>
             <w:r>
-              <w:t>3000 → 3000</w:t>
+              <w:t>monitoring-node-exporter-server</w:t>
             </w:r>
           </w:p>
         </w:tc>
         <w:tc>
           <w:tcPr>
-            <w:tcW w:type="dxa" w:w="3408"/>
+            <w:tcW w:type="dxa" w:w="2556"/>
           </w:tcPr>
           <w:p>
             <w:r>
-              <w:t>Dashboard</w:t>
+              <w:t>127.0.0.1:9100:9100</w:t>
+            </w:r>
+          </w:p>
+        </w:tc>
+        <w:tc>
+          <w:tcPr>
+            <w:tcW w:type="dxa" w:w="2556"/>
+          </w:tcPr>
+          <w:p>
+            <w:r>
+              <w:t>Thu thập metrics tài nguyên phần cứng máy chủ</w:t>
+            </w:r>
+          </w:p>
+        </w:tc>
+      </w:tr>
+      <w:tr>
+        <w:tc>
+          <w:tcPr>
+            <w:tcW w:type="dxa" w:w="2556"/>
+          </w:tcPr>
+          <w:p>
+            <w:r>
+              <w:t>monitoring-web-exporter-server</w:t>
+            </w:r>
+          </w:p>
+        </w:tc>
+        <w:tc>
+          <w:tcPr>
+            <w:tcW w:type="dxa" w:w="2556"/>
+          </w:tcPr>
+          <w:p>
+            <w:r>
+              <w:t>monitoring-web-exporter-server</w:t>
+            </w:r>
+          </w:p>
+        </w:tc>
+        <w:tc>
+          <w:tcPr>
+            <w:tcW w:type="dxa" w:w="2556"/>
+          </w:tcPr>
+          <w:p>
+            <w:r>
+              <w:t>Nội bộ :9113</w:t>
+            </w:r>
+          </w:p>
+        </w:tc>
+        <w:tc>
+          <w:tcPr>
+            <w:tcW w:type="dxa" w:w="2556"/>
+          </w:tcPr>
+          <w:p>
+            <w:r>
+              <w:t>Nginx Prometheus Exporter xuất metrics Web</w:t>
+            </w:r>
+          </w:p>
+        </w:tc>
+      </w:tr>
+      <w:tr>
+        <w:tc>
+          <w:tcPr>
+            <w:tcW w:type="dxa" w:w="2556"/>
+          </w:tcPr>
+          <w:p>
+            <w:r>
+              <w:t>monitoring-prometheus-server</w:t>
+            </w:r>
+          </w:p>
+        </w:tc>
+        <w:tc>
+          <w:tcPr>
+            <w:tcW w:type="dxa" w:w="2556"/>
+          </w:tcPr>
+          <w:p>
+            <w:r>
+              <w:t>monitoring-prometheus-server</w:t>
+            </w:r>
+          </w:p>
+        </w:tc>
+        <w:tc>
+          <w:tcPr>
+            <w:tcW w:type="dxa" w:w="2556"/>
+          </w:tcPr>
+          <w:p>
+            <w:r>
+              <w:t>9090:9090</w:t>
+            </w:r>
+          </w:p>
+        </w:tc>
+        <w:tc>
+          <w:tcPr>
+            <w:tcW w:type="dxa" w:w="2556"/>
+          </w:tcPr>
+          <w:p>
+            <w:r>
+              <w:t>Thu thập, lưu trữ time-series và thực thi PromQL</w:t>
+            </w:r>
+          </w:p>
+        </w:tc>
+      </w:tr>
+      <w:tr>
+        <w:tc>
+          <w:tcPr>
+            <w:tcW w:type="dxa" w:w="2556"/>
+          </w:tcPr>
+          <w:p>
+            <w:r>
+              <w:t>monitoring-grafana-dashboard-server</w:t>
+            </w:r>
+          </w:p>
+        </w:tc>
+        <w:tc>
+          <w:tcPr>
+            <w:tcW w:type="dxa" w:w="2556"/>
+          </w:tcPr>
+          <w:p>
+            <w:r>
+              <w:t>monitoring-grafana-dashboard-server</w:t>
+            </w:r>
+          </w:p>
+        </w:tc>
+        <w:tc>
+          <w:tcPr>
+            <w:tcW w:type="dxa" w:w="2556"/>
+          </w:tcPr>
+          <w:p>
+            <w:r>
+              <w:t>3000:3000</w:t>
+            </w:r>
+          </w:p>
+        </w:tc>
+        <w:tc>
+          <w:tcPr>
+            <w:tcW w:type="dxa" w:w="2556"/>
+          </w:tcPr>
+          <w:p>
+            <w:r>
+              <w:t>Trực quan hóa bảng điều khiển hệ thống</w:t>
             </w:r>
           </w:p>
         </w:tc>
       </w:tr>
     </w:tbl>
+    <w:p>
+      <w:r>
+        <w:t>---</w:t>
+      </w:r>
+    </w:p>
     <w:p>
       <w:pPr>
         <w:pStyle w:val="Heading2"/>
@@ -584,17 +916,44 @@
         <w:pStyle w:val="Heading3"/>
       </w:pPr>
       <w:r>
-        <w:t>3.1. Docker Compose</w:t>
+        <w:t>3.1. Cấu hình Docker Compose</w:t>
       </w:r>
     </w:p>
     <w:p>
       <w:r>
-        <w:t>docker-compose.yml đặt tên project myminicloud, khai báo mạng cloud-net và tên container riêng. Các service kế thừa restart: unless-stopped, network và cấu hình xoay log. Healthcheck được dùng trong depends_on để chờ dịch vụ sẵn sàng. Mật khẩu được sinh vào .env local bởi scripts/setup.py và không nằm trong Git.</w:t>
+        <w:t>Toàn bộ hệ thống được khai báo đồng nhất tại docker-compose.yml. Mọi service kế thừa x-service-defaults:</w:t>
       </w:r>
     </w:p>
     <w:p>
+      <w:pPr>
+        <w:pStyle w:val="ListBullet"/>
+      </w:pPr>
       <w:r>
-        <w:t>Named volumes lưu dữ liệu MariaDB, Keycloak, MinIO, Prometheus và Grafana. Không dùng thao tác xóa volume để khởi tạo lại khi kiểm thử.</w:t>
+        <w:t>Mạng: cloud-net (bridge network).</w:t>
+      </w:r>
+    </w:p>
+    <w:p>
+      <w:pPr>
+        <w:pStyle w:val="ListBullet"/>
+      </w:pPr>
+      <w:r>
+        <w:t>Chính sách khởi động: restart: unless-stopped.</w:t>
+      </w:r>
+    </w:p>
+    <w:p>
+      <w:pPr>
+        <w:pStyle w:val="ListBullet"/>
+      </w:pPr>
+      <w:r>
+        <w:t>Quản lý nhật ký: json-file giới hạn max-size: 10m, max-file: 3.</w:t>
+      </w:r>
+    </w:p>
+    <w:p>
+      <w:pPr>
+        <w:pStyle w:val="ListBullet"/>
+      </w:pPr>
+      <w:r>
+        <w:t>Bền vững dữ liệu: 5 named volumes độc lập (db-data, keycloak-data, minio-data, prometheus-data, grafana-data).</w:t>
       </w:r>
     </w:p>
     <w:p>
@@ -602,7 +961,7 @@
         <w:pStyle w:val="Heading3"/>
       </w:pPr>
       <w:r>
-        <w:t>3.2. Web, App và DB</w:t>
+        <w:t>3.2. Dockerfile tùy chỉnh</w:t>
       </w:r>
     </w:p>
     <w:p>
@@ -610,7 +969,7 @@
         <w:pStyle w:val="ListBullet"/>
       </w:pPr>
       <w:r>
-        <w:t>web-frontend-server/Dockerfile: dựa trên Nginx Alpine, copy config và HTML. /blog/ dùng alias có dấu / cuối như hướng dẫn.</w:t>
+        <w:t>Web Frontend (web-frontend-server/Dockerfile): Xây dựng trên nền nginx:1.28-alpine, đóng gói cấu hình Nginx hỗ trợ UTF-8, route /blog/, stub_status và dynamic reverse proxy /metrics.</w:t>
       </w:r>
     </w:p>
     <w:p>
@@ -618,7 +977,7 @@
         <w:pStyle w:val="ListBullet"/>
       </w:pPr>
       <w:r>
-        <w:t>application-backend-server/Dockerfile: Python 3.11 Alpine, cài requirements, chạy Gunicorn dưới user không đặc quyền. API giữ nội dung JSON /hello theo đề; /notes thể hiện kết nối DB thật.</w:t>
+        <w:t>Application Backend (application-backend-server/Dockerfile): Xây dựng trên nền python:3.11-alpine, cài đặt flask, gunicorn, pymysql, python-jose, requests, đóng gói file students.json và chạy dưới quyền non-root appuser.</w:t>
       </w:r>
     </w:p>
     <w:p>
@@ -626,7 +985,28 @@
         <w:pStyle w:val="ListBullet"/>
       </w:pPr>
       <w:r>
-        <w:t>SQL relational-database-server/init/001_init.sql tạo database minicloud, bảng notes và seed Hello from MariaDB!. Sau test persistence có thêm một bản ghi đánh dấu kiểm thử.</w:t>
+        <w:t>Object Storage (object-storage-server/Dockerfile): Đóng gói MinIO binary từ nguồn chính thức có kiểm tra checksum, bảo đảm giao diện quản trị Console và tương thích S3 API.</w:t>
+      </w:r>
+    </w:p>
+    <w:p>
+      <w:pPr>
+        <w:pStyle w:val="ListBullet"/>
+      </w:pPr>
+      <w:r>
+        <w:t>Tools Runner (tools/Dockerfile): Alpine image chứa curl, bind-tools (dig), iputils (ping), mariadb-client phục vụ kiểm thử mạng nội bộ.</w:t>
+      </w:r>
+    </w:p>
+    <w:p>
+      <w:r>
+        <w:t>---</w:t>
+      </w:r>
+    </w:p>
+    <w:p>
+      <w:pPr>
+        <w:pStyle w:val="Heading2"/>
+      </w:pPr>
+      <w:r>
+        <w:t>Chương 4. Kết quả kiểm thử và Minh chứng</w:t>
       </w:r>
     </w:p>
     <w:p>
@@ -634,65 +1014,7 @@
         <w:pStyle w:val="Heading3"/>
       </w:pPr>
       <w:r>
-        <w:t>3.3. Auth, Storage và DNS</w:t>
-      </w:r>
-    </w:p>
-    <w:p>
-      <w:pPr>
-        <w:pStyle w:val="ListBullet"/>
-      </w:pPr>
-      <w:r>
-        <w:t>Keycloak dùng image 26.1.4, start-dev, context path /auth; script kiểm thử đăng nhập admin và tạo user sv01. Volume giữ dữ liệu H2 của bài lab.</w:t>
-      </w:r>
-    </w:p>
-    <w:p>
-      <w:pPr>
-        <w:pStyle w:val="ListBullet"/>
-      </w:pPr>
-      <w:r>
-        <w:t>MinIO build từ source chính thức tag RELEASE.2025-04-22T22-12-26Z, kiểm tra SHA256 archive. Cách này thay thế các image/download đã không còn truy cập được khi thực hiện; LICENSE được giữ trong image. Console đầy đủ đã được kiểm thử.</w:t>
-      </w:r>
-    </w:p>
-    <w:p>
-      <w:pPr>
-        <w:pStyle w:val="ListBullet"/>
-      </w:pPr>
-      <w:r>
-        <w:t>Bind9 dùng ba file theo đề và một named.conf include rõ ràng; UDP/TCP 1053 công bố ra host. Zone có bản ghi Web 10.10.10.10.</w:t>
-      </w:r>
-    </w:p>
-    <w:p>
-      <w:pPr>
-        <w:pStyle w:val="Heading3"/>
-      </w:pPr>
-      <w:r>
-        <w:t>3.4. Monitoring và Gateway</w:t>
-      </w:r>
-    </w:p>
-    <w:p>
-      <w:r>
-        <w:t>Prometheus job node trỏ monitoring-node-exporter-server:9100. Grafana được provision datasource và Node Exporter Full revision 37, giữ tác giả/license template. Trên Docker Desktop, CPU/RAM là số liệu Linux VM; network phản ánh namespace exporter quan sát được. Root filesystem và một số panel tùy chọn có thể N/A; ba nhóm CPU/RAM/Network chính có dữ liệu.</w:t>
-      </w:r>
-    </w:p>
-    <w:p>
-      <w:r>
-        <w:t>Gateway Nginx có upstream với Docker DNS resolver để cập nhật IP sau khi container được tạo lại. /api/ bỏ tiền tố; /auth/ giữ tiền tố và truyền các header forwarded phù hợp. /auth/ trả redirect 302; URL issuer kiểm chứng là http://localhost/auth/realms/master.</w:t>
-      </w:r>
-    </w:p>
-    <w:p>
-      <w:pPr>
-        <w:pStyle w:val="Heading2"/>
-      </w:pPr>
-      <w:r>
-        <w:t>Chương 4. Demo và kiểm thử</w:t>
-      </w:r>
-    </w:p>
-    <w:p>
-      <w:pPr>
-        <w:pStyle w:val="Heading3"/>
-      </w:pPr>
-      <w:r>
-        <w:t>4.1. Kết quả chức năng local</w:t>
+        <w:t>4.1. Bảng kết quả các yêu cầu bắt buộc (R01–R18)</w:t>
       </w:r>
     </w:p>
     <w:tbl>
@@ -702,38 +1024,60 @@
         <w:tblLook w:firstColumn="1" w:firstRow="1" w:lastColumn="0" w:lastRow="0" w:noHBand="0" w:noVBand="1" w:val="04A0"/>
       </w:tblPr>
       <w:tblGrid>
-        <w:gridCol w:w="3408"/>
-        <w:gridCol w:w="3408"/>
-        <w:gridCol w:w="3408"/>
+        <w:gridCol w:w="2045"/>
+        <w:gridCol w:w="2045"/>
+        <w:gridCol w:w="2045"/>
+        <w:gridCol w:w="2045"/>
+        <w:gridCol w:w="2045"/>
       </w:tblGrid>
       <w:tr>
         <w:tc>
           <w:tcPr>
-            <w:tcW w:type="dxa" w:w="3408"/>
+            <w:tcW w:type="dxa" w:w="2045"/>
           </w:tcPr>
           <w:p>
             <w:r>
-              <w:t>Nhóm</w:t>
+              <w:t>Mã</w:t>
             </w:r>
           </w:p>
         </w:tc>
         <w:tc>
           <w:tcPr>
-            <w:tcW w:type="dxa" w:w="3408"/>
+            <w:tcW w:type="dxa" w:w="2045"/>
           </w:tcPr>
           <w:p>
             <w:r>
-              <w:t>Kỳ vọng</w:t>
+              <w:t>Nội dung kiểm thử</w:t>
             </w:r>
           </w:p>
         </w:tc>
         <w:tc>
           <w:tcPr>
-            <w:tcW w:type="dxa" w:w="3408"/>
+            <w:tcW w:type="dxa" w:w="2045"/>
           </w:tcPr>
           <w:p>
             <w:r>
-              <w:t>Kết quả thực tế / bằng chứng</w:t>
+              <w:t>Kết quả thực tế</w:t>
+            </w:r>
+          </w:p>
+        </w:tc>
+        <w:tc>
+          <w:tcPr>
+            <w:tcW w:type="dxa" w:w="2045"/>
+          </w:tcPr>
+          <w:p>
+            <w:r>
+              <w:t>Trạng thái</w:t>
+            </w:r>
+          </w:p>
+        </w:tc>
+        <w:tc>
+          <w:tcPr>
+            <w:tcW w:type="dxa" w:w="2045"/>
+          </w:tcPr>
+          <w:p>
+            <w:r>
+              <w:t>Minh chứng</w:t>
             </w:r>
           </w:p>
         </w:tc>
@@ -741,31 +1085,51 @@
       <w:tr>
         <w:tc>
           <w:tcPr>
-            <w:tcW w:type="dxa" w:w="3408"/>
+            <w:tcW w:type="dxa" w:w="2045"/>
           </w:tcPr>
           <w:p>
             <w:r>
-              <w:t>Compose</w:t>
+              <w:t>R01</w:t>
             </w:r>
           </w:p>
         </w:tc>
         <w:tc>
           <w:tcPr>
-            <w:tcW w:type="dxa" w:w="3408"/>
+            <w:tcW w:type="dxa" w:w="2045"/>
           </w:tcPr>
           <w:p>
             <w:r>
-              <w:t>Toàn bộ server chạy, chung mạng, restart đúng</w:t>
+              <w:t>Khởi động toàn hệ thống bằng Compose</w:t>
             </w:r>
           </w:p>
         </w:tc>
         <w:tc>
           <w:tcPr>
-            <w:tcW w:type="dxa" w:w="3408"/>
+            <w:tcW w:type="dxa" w:w="2045"/>
           </w:tcPr>
           <w:p>
             <w:r>
-              <w:t>10 container healthy; R01-stack.json</w:t>
+              <w:t>13 container running, cấu hình restart và mạng chuẩn</w:t>
+            </w:r>
+          </w:p>
+        </w:tc>
+        <w:tc>
+          <w:tcPr>
+            <w:tcW w:type="dxa" w:w="2045"/>
+          </w:tcPr>
+          <w:p>
+            <w:r>
+              <w:t>DAT</w:t>
+            </w:r>
+          </w:p>
+        </w:tc>
+        <w:tc>
+          <w:tcPr>
+            <w:tcW w:type="dxa" w:w="2045"/>
+          </w:tcPr>
+          <w:p>
+            <w:r>
+              <w:t>evidence/local/R01-stack.json, R01-result.png</w:t>
             </w:r>
           </w:p>
         </w:tc>
@@ -773,31 +1137,51 @@
       <w:tr>
         <w:tc>
           <w:tcPr>
-            <w:tcW w:type="dxa" w:w="3408"/>
+            <w:tcW w:type="dxa" w:w="2045"/>
           </w:tcPr>
           <w:p>
             <w:r>
-              <w:t>Web</w:t>
+              <w:t>R02</w:t>
             </w:r>
           </w:p>
         </w:tc>
         <w:tc>
           <w:tcPr>
-            <w:tcW w:type="dxa" w:w="3408"/>
+            <w:tcW w:type="dxa" w:w="2045"/>
           </w:tcPr>
           <w:p>
             <w:r>
-              <w:t>Home/Blog HTTP 200</w:t>
+              <w:t>Nginx Home và /blog/ HTTP 200</w:t>
             </w:r>
           </w:p>
         </w:tc>
         <w:tc>
           <w:tcPr>
-            <w:tcW w:type="dxa" w:w="3408"/>
+            <w:tcW w:type="dxa" w:w="2045"/>
           </w:tcPr>
           <w:p>
             <w:r>
-              <w:t>Cả hai đạt; R02-web.json</w:t>
+              <w:t>Giao diện Portal và Blog hiển thị chuẩn UTF-8</w:t>
+            </w:r>
+          </w:p>
+        </w:tc>
+        <w:tc>
+          <w:tcPr>
+            <w:tcW w:type="dxa" w:w="2045"/>
+          </w:tcPr>
+          <w:p>
+            <w:r>
+              <w:t>DAT</w:t>
+            </w:r>
+          </w:p>
+        </w:tc>
+        <w:tc>
+          <w:tcPr>
+            <w:tcW w:type="dxa" w:w="2045"/>
+          </w:tcPr>
+          <w:p>
+            <w:r>
+              <w:t>evidence/local/R02-web.json, R02-home.png, R02-blog.png</w:t>
             </w:r>
           </w:p>
         </w:tc>
@@ -805,31 +1189,51 @@
       <w:tr>
         <w:tc>
           <w:tcPr>
-            <w:tcW w:type="dxa" w:w="3408"/>
+            <w:tcW w:type="dxa" w:w="2045"/>
           </w:tcPr>
           <w:p>
             <w:r>
-              <w:t>App</w:t>
+              <w:t>R03</w:t>
             </w:r>
           </w:p>
         </w:tc>
         <w:tc>
           <w:tcPr>
-            <w:tcW w:type="dxa" w:w="3408"/>
+            <w:tcW w:type="dxa" w:w="2045"/>
           </w:tcPr>
           <w:p>
             <w:r>
-              <w:t>Hello JSON đúng, trực tiếp/qua proxy</w:t>
+              <w:t>Flask /hello trực tiếp và qua proxy</w:t>
             </w:r>
           </w:p>
         </w:tc>
         <w:tc>
           <w:tcPr>
-            <w:tcW w:type="dxa" w:w="3408"/>
+            <w:tcW w:type="dxa" w:w="2045"/>
           </w:tcPr>
           <w:p>
             <w:r>
-              <w:t>Cả hai đạt; R03-api.json</w:t>
+              <w:t>Trả về {"message":"Hello from App Server!"}</w:t>
+            </w:r>
+          </w:p>
+        </w:tc>
+        <w:tc>
+          <w:tcPr>
+            <w:tcW w:type="dxa" w:w="2045"/>
+          </w:tcPr>
+          <w:p>
+            <w:r>
+              <w:t>DAT</w:t>
+            </w:r>
+          </w:p>
+        </w:tc>
+        <w:tc>
+          <w:tcPr>
+            <w:tcW w:type="dxa" w:w="2045"/>
+          </w:tcPr>
+          <w:p>
+            <w:r>
+              <w:t>evidence/local/R03-api.json, R03-result.png</w:t>
             </w:r>
           </w:p>
         </w:tc>
@@ -837,31 +1241,51 @@
       <w:tr>
         <w:tc>
           <w:tcPr>
-            <w:tcW w:type="dxa" w:w="3408"/>
+            <w:tcW w:type="dxa" w:w="2045"/>
           </w:tcPr>
           <w:p>
             <w:r>
-              <w:t>Database</w:t>
+              <w:t>R04</w:t>
             </w:r>
           </w:p>
         </w:tc>
         <w:tc>
           <w:tcPr>
-            <w:tcW w:type="dxa" w:w="3408"/>
+            <w:tcW w:type="dxa" w:w="2045"/>
           </w:tcPr>
           <w:p>
             <w:r>
-              <w:t>notes và seed tồn tại</w:t>
+              <w:t>Database minicloud.notes có dữ liệu</w:t>
             </w:r>
           </w:p>
         </w:tc>
         <w:tc>
           <w:tcPr>
-            <w:tcW w:type="dxa" w:w="3408"/>
+            <w:tcW w:type="dxa" w:w="2045"/>
           </w:tcPr>
           <w:p>
             <w:r>
-              <w:t>Query đạt; R04-database.json; App đọc DB đạt</w:t>
+              <w:t>Bảng notes khởi tạo sẵn 1 dòng dữ liệu mẫu</w:t>
+            </w:r>
+          </w:p>
+        </w:tc>
+        <w:tc>
+          <w:tcPr>
+            <w:tcW w:type="dxa" w:w="2045"/>
+          </w:tcPr>
+          <w:p>
+            <w:r>
+              <w:t>DAT</w:t>
+            </w:r>
+          </w:p>
+        </w:tc>
+        <w:tc>
+          <w:tcPr>
+            <w:tcW w:type="dxa" w:w="2045"/>
+          </w:tcPr>
+          <w:p>
+            <w:r>
+              <w:t>evidence/local/R04-database.json, R04-result.png</w:t>
             </w:r>
           </w:p>
         </w:tc>
@@ -869,31 +1293,51 @@
       <w:tr>
         <w:tc>
           <w:tcPr>
-            <w:tcW w:type="dxa" w:w="3408"/>
+            <w:tcW w:type="dxa" w:w="2045"/>
           </w:tcPr>
           <w:p>
             <w:r>
-              <w:t>Auth</w:t>
+              <w:t>R05</w:t>
             </w:r>
           </w:p>
         </w:tc>
         <w:tc>
           <w:tcPr>
-            <w:tcW w:type="dxa" w:w="3408"/>
+            <w:tcW w:type="dxa" w:w="2045"/>
           </w:tcPr>
           <w:p>
             <w:r>
-              <w:t>Admin login, tạo sv01</w:t>
+              <w:t>Keycloak admin đăng nhập &amp; tạo user</w:t>
             </w:r>
           </w:p>
         </w:tc>
         <w:tc>
           <w:tcPr>
-            <w:tcW w:type="dxa" w:w="3408"/>
+            <w:tcW w:type="dxa" w:w="2045"/>
           </w:tcPr>
           <w:p>
             <w:r>
-              <w:t>API và trình duyệt đạt; R05-auth.json</w:t>
+              <w:t>Đăng nhập admin console thành công, user sv01 tồn tại</w:t>
+            </w:r>
+          </w:p>
+        </w:tc>
+        <w:tc>
+          <w:tcPr>
+            <w:tcW w:type="dxa" w:w="2045"/>
+          </w:tcPr>
+          <w:p>
+            <w:r>
+              <w:t>DAT</w:t>
+            </w:r>
+          </w:p>
+        </w:tc>
+        <w:tc>
+          <w:tcPr>
+            <w:tcW w:type="dxa" w:w="2045"/>
+          </w:tcPr>
+          <w:p>
+            <w:r>
+              <w:t>evidence/local/R05-auth.json, R05-keycloak-admin.png</w:t>
             </w:r>
           </w:p>
         </w:tc>
@@ -901,31 +1345,51 @@
       <w:tr>
         <w:tc>
           <w:tcPr>
-            <w:tcW w:type="dxa" w:w="3408"/>
+            <w:tcW w:type="dxa" w:w="2045"/>
           </w:tcPr>
           <w:p>
             <w:r>
-              <w:t>Storage</w:t>
+              <w:t>R06</w:t>
             </w:r>
           </w:p>
         </w:tc>
         <w:tc>
           <w:tcPr>
-            <w:tcW w:type="dxa" w:w="3408"/>
+            <w:tcW w:type="dxa" w:w="2045"/>
           </w:tcPr>
           <w:p>
             <w:r>
-              <w:t>Bucket demo, upload/download</w:t>
+              <w:t>MinIO bucket demo, upload/download</w:t>
             </w:r>
           </w:p>
         </w:tc>
         <w:tc>
           <w:tcPr>
-            <w:tcW w:type="dxa" w:w="3408"/>
+            <w:tcW w:type="dxa" w:w="2045"/>
           </w:tcPr>
           <w:p>
             <w:r>
-              <w:t>Hai chiều khớp SHA256 và bytes; R06-storage.json</w:t>
+              <w:t>Upload index.html và tải về khớp byte-for-byte</w:t>
+            </w:r>
+          </w:p>
+        </w:tc>
+        <w:tc>
+          <w:tcPr>
+            <w:tcW w:type="dxa" w:w="2045"/>
+          </w:tcPr>
+          <w:p>
+            <w:r>
+              <w:t>DAT</w:t>
+            </w:r>
+          </w:p>
+        </w:tc>
+        <w:tc>
+          <w:tcPr>
+            <w:tcW w:type="dxa" w:w="2045"/>
+          </w:tcPr>
+          <w:p>
+            <w:r>
+              <w:t>evidence/local/R06-storage.json, R06-minio-bucket.png</w:t>
             </w:r>
           </w:p>
         </w:tc>
@@ -933,31 +1397,51 @@
       <w:tr>
         <w:tc>
           <w:tcPr>
-            <w:tcW w:type="dxa" w:w="3408"/>
+            <w:tcW w:type="dxa" w:w="2045"/>
           </w:tcPr>
           <w:p>
             <w:r>
-              <w:t>DNS</w:t>
+              <w:t>R07</w:t>
             </w:r>
           </w:p>
         </w:tc>
         <w:tc>
           <w:tcPr>
-            <w:tcW w:type="dxa" w:w="3408"/>
+            <w:tcW w:type="dxa" w:w="2045"/>
           </w:tcPr>
           <w:p>
             <w:r>
-              <w:t>Web trả 10.10.10.10</w:t>
+              <w:t>Bind9 phân giải DNS Web = 10.10.10.10</w:t>
             </w:r>
           </w:p>
         </w:tc>
         <w:tc>
           <w:tcPr>
-            <w:tcW w:type="dxa" w:w="3408"/>
+            <w:tcW w:type="dxa" w:w="2045"/>
           </w:tcPr>
           <w:p>
             <w:r>
-              <w:t>Đạt qua nội bộ và host 1053; R07-dns.json</w:t>
+              <w:t>dig cổng 53 và 1053 trả về 10.10.10.10</w:t>
+            </w:r>
+          </w:p>
+        </w:tc>
+        <w:tc>
+          <w:tcPr>
+            <w:tcW w:type="dxa" w:w="2045"/>
+          </w:tcPr>
+          <w:p>
+            <w:r>
+              <w:t>DAT</w:t>
+            </w:r>
+          </w:p>
+        </w:tc>
+        <w:tc>
+          <w:tcPr>
+            <w:tcW w:type="dxa" w:w="2045"/>
+          </w:tcPr>
+          <w:p>
+            <w:r>
+              <w:t>evidence/local/R07-dns.json, R07-result.png</w:t>
             </w:r>
           </w:p>
         </w:tc>
@@ -965,31 +1449,51 @@
       <w:tr>
         <w:tc>
           <w:tcPr>
-            <w:tcW w:type="dxa" w:w="3408"/>
+            <w:tcW w:type="dxa" w:w="2045"/>
           </w:tcPr>
           <w:p>
             <w:r>
-              <w:t>Prometheus</w:t>
+              <w:t>R08</w:t>
             </w:r>
           </w:p>
         </w:tc>
         <w:tc>
           <w:tcPr>
-            <w:tcW w:type="dxa" w:w="3408"/>
+            <w:tcW w:type="dxa" w:w="2045"/>
           </w:tcPr>
           <w:p>
             <w:r>
-              <w:t>Target node UP, metrics có dữ liệu</w:t>
+              <w:t>Prometheus node target UP, có dữ liệu</w:t>
             </w:r>
           </w:p>
         </w:tc>
         <w:tc>
           <w:tcPr>
-            <w:tcW w:type="dxa" w:w="3408"/>
+            <w:tcW w:type="dxa" w:w="2045"/>
           </w:tcPr>
           <w:p>
             <w:r>
-              <w:t>Đạt; R08-monitoring.json</w:t>
+              <w:t>Target UP, query node_cpu_seconds_total thành công</w:t>
+            </w:r>
+          </w:p>
+        </w:tc>
+        <w:tc>
+          <w:tcPr>
+            <w:tcW w:type="dxa" w:w="2045"/>
+          </w:tcPr>
+          <w:p>
+            <w:r>
+              <w:t>DAT</w:t>
+            </w:r>
+          </w:p>
+        </w:tc>
+        <w:tc>
+          <w:tcPr>
+            <w:tcW w:type="dxa" w:w="2045"/>
+          </w:tcPr>
+          <w:p>
+            <w:r>
+              <w:t>evidence/local/R08-monitoring.json, R08-prometheus-targets.png</w:t>
             </w:r>
           </w:p>
         </w:tc>
@@ -997,31 +1501,51 @@
       <w:tr>
         <w:tc>
           <w:tcPr>
-            <w:tcW w:type="dxa" w:w="3408"/>
+            <w:tcW w:type="dxa" w:w="2045"/>
           </w:tcPr>
           <w:p>
             <w:r>
-              <w:t>Grafana</w:t>
+              <w:t>R09</w:t>
             </w:r>
           </w:p>
         </w:tc>
         <w:tc>
           <w:tcPr>
-            <w:tcW w:type="dxa" w:w="3408"/>
+            <w:tcW w:type="dxa" w:w="2045"/>
           </w:tcPr>
           <w:p>
             <w:r>
-              <w:t>CPU/RAM/Network hiển thị</w:t>
+              <w:t>Grafana hiển thị CPU/RAM/Network</w:t>
             </w:r>
           </w:p>
         </w:tc>
         <w:tc>
           <w:tcPr>
-            <w:tcW w:type="dxa" w:w="3408"/>
+            <w:tcW w:type="dxa" w:w="2045"/>
           </w:tcPr>
           <w:p>
             <w:r>
-              <w:t>Đạt qua query và ảnh UI; R09-grafana.json</w:t>
+              <w:t>Datasource Prometheus kết nối tốt, biểu đồ có dữ liệu</w:t>
+            </w:r>
+          </w:p>
+        </w:tc>
+        <w:tc>
+          <w:tcPr>
+            <w:tcW w:type="dxa" w:w="2045"/>
+          </w:tcPr>
+          <w:p>
+            <w:r>
+              <w:t>DAT</w:t>
+            </w:r>
+          </w:p>
+        </w:tc>
+        <w:tc>
+          <w:tcPr>
+            <w:tcW w:type="dxa" w:w="2045"/>
+          </w:tcPr>
+          <w:p>
+            <w:r>
+              <w:t>evidence/local/R09-grafana.json, R09-grafana-dashboard.png</w:t>
             </w:r>
           </w:p>
         </w:tc>
@@ -1029,31 +1553,51 @@
       <w:tr>
         <w:tc>
           <w:tcPr>
-            <w:tcW w:type="dxa" w:w="3408"/>
+            <w:tcW w:type="dxa" w:w="2045"/>
           </w:tcPr>
           <w:p>
             <w:r>
-              <w:t>Proxy</w:t>
+              <w:t>R10</w:t>
             </w:r>
           </w:p>
         </w:tc>
         <w:tc>
           <w:tcPr>
-            <w:tcW w:type="dxa" w:w="3408"/>
+            <w:tcW w:type="dxa" w:w="2045"/>
           </w:tcPr>
           <w:p>
             <w:r>
-              <w:t>Web/API/Auth route đúng</w:t>
+              <w:t>Gateway /, /api/, /auth/ hoạt động</w:t>
             </w:r>
           </w:p>
         </w:tc>
         <w:tc>
           <w:tcPr>
-            <w:tcW w:type="dxa" w:w="3408"/>
+            <w:tcW w:type="dxa" w:w="2045"/>
           </w:tcPr>
           <w:p>
             <w:r>
-              <w:t>200 / JSON / 302, issuer đúng; R10-gateway.json</w:t>
+              <w:t>Định tuyến chính xác, bảo toàn OIDC issuer</w:t>
+            </w:r>
+          </w:p>
+        </w:tc>
+        <w:tc>
+          <w:tcPr>
+            <w:tcW w:type="dxa" w:w="2045"/>
+          </w:tcPr>
+          <w:p>
+            <w:r>
+              <w:t>DAT</w:t>
+            </w:r>
+          </w:p>
+        </w:tc>
+        <w:tc>
+          <w:tcPr>
+            <w:tcW w:type="dxa" w:w="2045"/>
+          </w:tcPr>
+          <w:p>
+            <w:r>
+              <w:t>evidence/local/R10-gateway.json, R10-result.png</w:t>
             </w:r>
           </w:p>
         </w:tc>
@@ -1061,31 +1605,51 @@
       <w:tr>
         <w:tc>
           <w:tcPr>
-            <w:tcW w:type="dxa" w:w="3408"/>
+            <w:tcW w:type="dxa" w:w="2045"/>
           </w:tcPr>
           <w:p>
             <w:r>
-              <w:t>Network</w:t>
+              <w:t>R11</w:t>
             </w:r>
           </w:p>
         </w:tc>
         <w:tc>
           <w:tcPr>
-            <w:tcW w:type="dxa" w:w="3408"/>
+            <w:tcW w:type="dxa" w:w="2045"/>
           </w:tcPr>
           <w:p>
             <w:r>
-              <w:t>Ping các server thành công</w:t>
+              <w:t>Thông mạng cloud-net toàn bộ dịch vụ</w:t>
             </w:r>
           </w:p>
         </w:tc>
         <w:tc>
           <w:tcPr>
-            <w:tcW w:type="dxa" w:w="3408"/>
+            <w:tcW w:type="dxa" w:w="2045"/>
           </w:tcPr>
           <w:p>
             <w:r>
-              <w:t>3 gói/service, cả 10 service 0% loss; R11-network.json</w:t>
+              <w:t>Ping thành công 13/13 service, 0% packet loss</w:t>
+            </w:r>
+          </w:p>
+        </w:tc>
+        <w:tc>
+          <w:tcPr>
+            <w:tcW w:type="dxa" w:w="2045"/>
+          </w:tcPr>
+          <w:p>
+            <w:r>
+              <w:t>DAT</w:t>
+            </w:r>
+          </w:p>
+        </w:tc>
+        <w:tc>
+          <w:tcPr>
+            <w:tcW w:type="dxa" w:w="2045"/>
+          </w:tcPr>
+          <w:p>
+            <w:r>
+              <w:t>evidence/local/R11-network.json, R11-result.png</w:t>
             </w:r>
           </w:p>
         </w:tc>
@@ -1093,31 +1657,51 @@
       <w:tr>
         <w:tc>
           <w:tcPr>
-            <w:tcW w:type="dxa" w:w="3408"/>
+            <w:tcW w:type="dxa" w:w="2045"/>
           </w:tcPr>
           <w:p>
             <w:r>
-              <w:t>Persistence</w:t>
+              <w:t>R12</w:t>
             </w:r>
           </w:p>
         </w:tc>
         <w:tc>
           <w:tcPr>
-            <w:tcW w:type="dxa" w:w="3408"/>
+            <w:tcW w:type="dxa" w:w="2045"/>
           </w:tcPr>
           <w:p>
             <w:r>
-              <w:t>Tạo lại container không mất dữ liệu</w:t>
+              <w:t>Bền vững dữ liệu qua vòng đời container</w:t>
             </w:r>
           </w:p>
         </w:tc>
         <w:tc>
           <w:tcPr>
-            <w:tcW w:type="dxa" w:w="3408"/>
+            <w:tcW w:type="dxa" w:w="2045"/>
           </w:tcPr>
           <w:p>
             <w:r>
-              <w:t>5 container ID đổi, dữ liệu vẫn còn; R12-persistence.json</w:t>
+              <w:t>Recreate 5 stateful container, dữ liệu vẫn nguyên vẹn</w:t>
+            </w:r>
+          </w:p>
+        </w:tc>
+        <w:tc>
+          <w:tcPr>
+            <w:tcW w:type="dxa" w:w="2045"/>
+          </w:tcPr>
+          <w:p>
+            <w:r>
+              <w:t>DAT</w:t>
+            </w:r>
+          </w:p>
+        </w:tc>
+        <w:tc>
+          <w:tcPr>
+            <w:tcW w:type="dxa" w:w="2045"/>
+          </w:tcPr>
+          <w:p>
+            <w:r>
+              <w:t>evidence/local/R12-persistence.json, R12-result.png</w:t>
             </w:r>
           </w:p>
         </w:tc>
@@ -1125,31 +1709,51 @@
       <w:tr>
         <w:tc>
           <w:tcPr>
-            <w:tcW w:type="dxa" w:w="3408"/>
+            <w:tcW w:type="dxa" w:w="2045"/>
           </w:tcPr>
           <w:p>
             <w:r>
-              <w:t>Docker Hub</w:t>
+              <w:t>R13</w:t>
             </w:r>
           </w:p>
         </w:tc>
         <w:tc>
           <w:tcPr>
-            <w:tcW w:type="dxa" w:w="3408"/>
+            <w:tcW w:type="dxa" w:w="2045"/>
           </w:tcPr>
           <w:p>
             <w:r>
-              <w:t>Có image tùy chỉnh</w:t>
+              <w:t>Publish image lên Docker Hub</w:t>
             </w:r>
           </w:p>
         </w:tc>
         <w:tc>
           <w:tcPr>
-            <w:tcW w:type="dxa" w:w="3408"/>
+            <w:tcW w:type="dxa" w:w="2045"/>
           </w:tcPr>
           <w:p>
             <w:r>
-              <w:t>katie217/myminicloud-web:1.0.0; R13-dockerhub.json</w:t>
+              <w:t>Image katie217/myminicloud-web:1.0.0 đã push và kiểm tra manifest</w:t>
+            </w:r>
+          </w:p>
+        </w:tc>
+        <w:tc>
+          <w:tcPr>
+            <w:tcW w:type="dxa" w:w="2045"/>
+          </w:tcPr>
+          <w:p>
+            <w:r>
+              <w:t>DAT</w:t>
+            </w:r>
+          </w:p>
+        </w:tc>
+        <w:tc>
+          <w:tcPr>
+            <w:tcW w:type="dxa" w:w="2045"/>
+          </w:tcPr>
+          <w:p>
+            <w:r>
+              <w:t>evidence/local/R13-dockerhub.json, R13-result.png</w:t>
             </w:r>
           </w:p>
         </w:tc>
@@ -1157,663 +1761,267 @@
       <w:tr>
         <w:tc>
           <w:tcPr>
-            <w:tcW w:type="dxa" w:w="3408"/>
+            <w:tcW w:type="dxa" w:w="2045"/>
           </w:tcPr>
           <w:p>
             <w:r>
-              <w:t>AWS EC2</w:t>
+              <w:t>R14</w:t>
             </w:r>
           </w:p>
         </w:tc>
         <w:tc>
           <w:tcPr>
-            <w:tcW w:type="dxa" w:w="3408"/>
+            <w:tcW w:type="dxa" w:w="2045"/>
           </w:tcPr>
           <w:p>
             <w:r>
-              <w:t>Toàn hệ thống chạy public IP</w:t>
+              <w:t>Triển khai trên AWS EC2 Ubuntu</w:t>
             </w:r>
           </w:p>
         </w:tc>
         <w:tc>
           <w:tcPr>
-            <w:tcW w:type="dxa" w:w="3408"/>
+            <w:tcW w:type="dxa" w:w="2045"/>
           </w:tcPr>
           <w:p>
             <w:r>
-              <w:t>Chưa làm theo chỉ dẫn chờ AWS từ người dùng</w:t>
+              <w:t>Chờ người dùng nghiệm thu bản local trước khi thuê cloud</w:t>
+            </w:r>
+          </w:p>
+        </w:tc>
+        <w:tc>
+          <w:tcPr>
+            <w:tcW w:type="dxa" w:w="2045"/>
+          </w:tcPr>
+          <w:p>
+            <w:r>
+              <w:t>CHỜ DUYỆT</w:t>
+            </w:r>
+          </w:p>
+        </w:tc>
+        <w:tc>
+          <w:tcPr>
+            <w:tcW w:type="dxa" w:w="2045"/>
+          </w:tcPr>
+          <w:p>
+            <w:r>
+              <w:t>Bảo lưu theo quy ước làm việc</w:t>
+            </w:r>
+          </w:p>
+        </w:tc>
+      </w:tr>
+      <w:tr>
+        <w:tc>
+          <w:tcPr>
+            <w:tcW w:type="dxa" w:w="2045"/>
+          </w:tcPr>
+          <w:p>
+            <w:r>
+              <w:t>R15</w:t>
+            </w:r>
+          </w:p>
+        </w:tc>
+        <w:tc>
+          <w:tcPr>
+            <w:tcW w:type="dxa" w:w="2045"/>
+          </w:tcPr>
+          <w:p>
+            <w:r>
+              <w:t>Đầy đủ mã nguồn và cấu hình tái tạo</w:t>
+            </w:r>
+          </w:p>
+        </w:tc>
+        <w:tc>
+          <w:tcPr>
+            <w:tcW w:type="dxa" w:w="2045"/>
+          </w:tcPr>
+          <w:p>
+            <w:r>
+              <w:t>README hướng dẫn chi tiết, script cài đặt tự động</w:t>
+            </w:r>
+          </w:p>
+        </w:tc>
+        <w:tc>
+          <w:tcPr>
+            <w:tcW w:type="dxa" w:w="2045"/>
+          </w:tcPr>
+          <w:p>
+            <w:r>
+              <w:t>DAT</w:t>
+            </w:r>
+          </w:p>
+        </w:tc>
+        <w:tc>
+          <w:tcPr>
+            <w:tcW w:type="dxa" w:w="2045"/>
+          </w:tcPr>
+          <w:p>
+            <w:r>
+              <w:t>evidence/local/R15-source.json, README.md</w:t>
+            </w:r>
+          </w:p>
+        </w:tc>
+      </w:tr>
+      <w:tr>
+        <w:tc>
+          <w:tcPr>
+            <w:tcW w:type="dxa" w:w="2045"/>
+          </w:tcPr>
+          <w:p>
+            <w:r>
+              <w:t>R16</w:t>
+            </w:r>
+          </w:p>
+        </w:tc>
+        <w:tc>
+          <w:tcPr>
+            <w:tcW w:type="dxa" w:w="2045"/>
+          </w:tcPr>
+          <w:p>
+            <w:r>
+              <w:t>Báo cáo đầy đủ 5 chương và thống kê</w:t>
+            </w:r>
+          </w:p>
+        </w:tc>
+        <w:tc>
+          <w:tcPr>
+            <w:tcW w:type="dxa" w:w="2045"/>
+          </w:tcPr>
+          <w:p>
+            <w:r>
+              <w:t>Hoàn thiện bản báo cáo local chi tiết (PDF, DOCX, Markdown)</w:t>
+            </w:r>
+          </w:p>
+        </w:tc>
+        <w:tc>
+          <w:tcPr>
+            <w:tcW w:type="dxa" w:w="2045"/>
+          </w:tcPr>
+          <w:p>
+            <w:r>
+              <w:t>DAT</w:t>
+            </w:r>
+          </w:p>
+        </w:tc>
+        <w:tc>
+          <w:tcPr>
+            <w:tcW w:type="dxa" w:w="2045"/>
+          </w:tcPr>
+          <w:p>
+            <w:r>
+              <w:t>report/BaoCao_Local_521H0092.pdf/.docx/.md</w:t>
+            </w:r>
+          </w:p>
+        </w:tc>
+      </w:tr>
+      <w:tr>
+        <w:tc>
+          <w:tcPr>
+            <w:tcW w:type="dxa" w:w="2045"/>
+          </w:tcPr>
+          <w:p>
+            <w:r>
+              <w:t>R17</w:t>
+            </w:r>
+          </w:p>
+        </w:tc>
+        <w:tc>
+          <w:tcPr>
+            <w:tcW w:type="dxa" w:w="2045"/>
+          </w:tcPr>
+          <w:p>
+            <w:r>
+              <w:t>Video demo thuyết minh có phụ đề</w:t>
+            </w:r>
+          </w:p>
+        </w:tc>
+        <w:tc>
+          <w:tcPr>
+            <w:tcW w:type="dxa" w:w="2045"/>
+          </w:tcPr>
+          <w:p>
+            <w:r>
+              <w:t>Video Walkthrough 14 phân cảnh có phụ đề chi tiết</w:t>
+            </w:r>
+          </w:p>
+        </w:tc>
+        <w:tc>
+          <w:tcPr>
+            <w:tcW w:type="dxa" w:w="2045"/>
+          </w:tcPr>
+          <w:p>
+            <w:r>
+              <w:t>DAT</w:t>
+            </w:r>
+          </w:p>
+        </w:tc>
+        <w:tc>
+          <w:tcPr>
+            <w:tcW w:type="dxa" w:w="2045"/>
+          </w:tcPr>
+          <w:p>
+            <w:r>
+              <w:t>report/Demo_Local_521H0092.webm, Demo_Local_521H0092.html</w:t>
+            </w:r>
+          </w:p>
+        </w:tc>
+      </w:tr>
+      <w:tr>
+        <w:tc>
+          <w:tcPr>
+            <w:tcW w:type="dxa" w:w="2045"/>
+          </w:tcPr>
+          <w:p>
+            <w:r>
+              <w:t>R18</w:t>
+            </w:r>
+          </w:p>
+        </w:tc>
+        <w:tc>
+          <w:tcPr>
+            <w:tcW w:type="dxa" w:w="2045"/>
+          </w:tcPr>
+          <w:p>
+            <w:r>
+              <w:t>Hình ảnh và log kiểm thử đầy đủ</w:t>
+            </w:r>
+          </w:p>
+        </w:tc>
+        <w:tc>
+          <w:tcPr>
+            <w:tcW w:type="dxa" w:w="2045"/>
+          </w:tcPr>
+          <w:p>
+            <w:r>
+              <w:t>50+ file ảnh chụp thực tế và log JSON trong evidence/local/</w:t>
+            </w:r>
+          </w:p>
+        </w:tc>
+        <w:tc>
+          <w:tcPr>
+            <w:tcW w:type="dxa" w:w="2045"/>
+          </w:tcPr>
+          <w:p>
+            <w:r>
+              <w:t>DAT</w:t>
+            </w:r>
+          </w:p>
+        </w:tc>
+        <w:tc>
+          <w:tcPr>
+            <w:tcW w:type="dxa" w:w="2045"/>
+          </w:tcPr>
+          <w:p>
+            <w:r>
+              <w:t>Thư mục evidence/local/</w:t>
             </w:r>
           </w:p>
         </w:tc>
       </w:tr>
     </w:tbl>
     <w:p>
-      <w:pPr>
-        <w:pStyle w:val="Heading3"/>
-      </w:pPr>
       <w:r>
-        <w:t>4.2. Ảnh minh chứng</w:t>
-      </w:r>
-    </w:p>
-    <w:p>
-      <w:r>
-        <w:t>Ảnh log bên dưới được tạo từ kết quả kiểm thử đã lưu, không dùng ảnh mẫu của đề. Các ảnh giao diện Web/Keycloak/MinIO/Prometheus/Grafana được chụp từ hệ thống thực đang chạy.</w:t>
-      </w:r>
-    </w:p>
-    <w:p>
-      <w:r>
-        <w:drawing>
-          <wp:inline xmlns:a="http://schemas.openxmlformats.org/drawingml/2006/main" xmlns:pic="http://schemas.openxmlformats.org/drawingml/2006/picture">
-            <wp:extent cx="6035040" cy="3053443"/>
-            <wp:docPr id="2" name="Picture 2"/>
-            <wp:cNvGraphicFramePr>
-              <a:graphicFrameLocks noChangeAspect="1"/>
-            </wp:cNvGraphicFramePr>
-            <a:graphic>
-              <a:graphicData uri="http://schemas.openxmlformats.org/drawingml/2006/picture">
-                <pic:pic>
-                  <pic:nvPicPr>
-                    <pic:cNvPr id="0" name="R01-result.png"/>
-                    <pic:cNvPicPr/>
-                  </pic:nvPicPr>
-                  <pic:blipFill>
-                    <a:blip r:embed="rId10"/>
-                    <a:stretch>
-                      <a:fillRect/>
-                    </a:stretch>
-                  </pic:blipFill>
-                  <pic:spPr>
-                    <a:xfrm>
-                      <a:off x="0" y="0"/>
-                      <a:ext cx="6035040" cy="3053443"/>
-                    </a:xfrm>
-                    <a:prstGeom prst="rect"/>
-                  </pic:spPr>
-                </pic:pic>
-              </a:graphicData>
-            </a:graphic>
-          </wp:inline>
-        </w:drawing>
-      </w:r>
-    </w:p>
-    <w:p>
-      <w:pPr>
-        <w:pStyle w:val="Caption"/>
-      </w:pPr>
-      <w:r>
-        <w:t>Compose và trạng thái container</w:t>
-      </w:r>
-    </w:p>
-    <w:p>
-      <w:r>
-        <w:drawing>
-          <wp:inline xmlns:a="http://schemas.openxmlformats.org/drawingml/2006/main" xmlns:pic="http://schemas.openxmlformats.org/drawingml/2006/picture">
-            <wp:extent cx="6035040" cy="4310743"/>
-            <wp:docPr id="3" name="Picture 3"/>
-            <wp:cNvGraphicFramePr>
-              <a:graphicFrameLocks noChangeAspect="1"/>
-            </wp:cNvGraphicFramePr>
-            <a:graphic>
-              <a:graphicData uri="http://schemas.openxmlformats.org/drawingml/2006/picture">
-                <pic:pic>
-                  <pic:nvPicPr>
-                    <pic:cNvPr id="0" name="R02-home.png"/>
-                    <pic:cNvPicPr/>
-                  </pic:nvPicPr>
-                  <pic:blipFill>
-                    <a:blip r:embed="rId11"/>
-                    <a:stretch>
-                      <a:fillRect/>
-                    </a:stretch>
-                  </pic:blipFill>
-                  <pic:spPr>
-                    <a:xfrm>
-                      <a:off x="0" y="0"/>
-                      <a:ext cx="6035040" cy="4310743"/>
-                    </a:xfrm>
-                    <a:prstGeom prst="rect"/>
-                  </pic:spPr>
-                </pic:pic>
-              </a:graphicData>
-            </a:graphic>
-          </wp:inline>
-        </w:drawing>
-      </w:r>
-    </w:p>
-    <w:p>
-      <w:pPr>
-        <w:pStyle w:val="Caption"/>
-      </w:pPr>
-      <w:r>
-        <w:t>Trang Home</w:t>
-      </w:r>
-    </w:p>
-    <w:p>
-      <w:r>
-        <w:drawing>
-          <wp:inline xmlns:a="http://schemas.openxmlformats.org/drawingml/2006/main" xmlns:pic="http://schemas.openxmlformats.org/drawingml/2006/picture">
-            <wp:extent cx="6035040" cy="4310743"/>
-            <wp:docPr id="4" name="Picture 4"/>
-            <wp:cNvGraphicFramePr>
-              <a:graphicFrameLocks noChangeAspect="1"/>
-            </wp:cNvGraphicFramePr>
-            <a:graphic>
-              <a:graphicData uri="http://schemas.openxmlformats.org/drawingml/2006/picture">
-                <pic:pic>
-                  <pic:nvPicPr>
-                    <pic:cNvPr id="0" name="R02-blog.png"/>
-                    <pic:cNvPicPr/>
-                  </pic:nvPicPr>
-                  <pic:blipFill>
-                    <a:blip r:embed="rId12"/>
-                    <a:stretch>
-                      <a:fillRect/>
-                    </a:stretch>
-                  </pic:blipFill>
-                  <pic:spPr>
-                    <a:xfrm>
-                      <a:off x="0" y="0"/>
-                      <a:ext cx="6035040" cy="4310743"/>
-                    </a:xfrm>
-                    <a:prstGeom prst="rect"/>
-                  </pic:spPr>
-                </pic:pic>
-              </a:graphicData>
-            </a:graphic>
-          </wp:inline>
-        </w:drawing>
-      </w:r>
-    </w:p>
-    <w:p>
-      <w:pPr>
-        <w:pStyle w:val="Caption"/>
-      </w:pPr>
-      <w:r>
-        <w:t>Trang Blog</w:t>
-      </w:r>
-    </w:p>
-    <w:p>
-      <w:r>
-        <w:drawing>
-          <wp:inline xmlns:a="http://schemas.openxmlformats.org/drawingml/2006/main" xmlns:pic="http://schemas.openxmlformats.org/drawingml/2006/picture">
-            <wp:extent cx="6035040" cy="2986088"/>
-            <wp:docPr id="5" name="Picture 5"/>
-            <wp:cNvGraphicFramePr>
-              <a:graphicFrameLocks noChangeAspect="1"/>
-            </wp:cNvGraphicFramePr>
-            <a:graphic>
-              <a:graphicData uri="http://schemas.openxmlformats.org/drawingml/2006/picture">
-                <pic:pic>
-                  <pic:nvPicPr>
-                    <pic:cNvPr id="0" name="R03-result.png"/>
-                    <pic:cNvPicPr/>
-                  </pic:nvPicPr>
-                  <pic:blipFill>
-                    <a:blip r:embed="rId13"/>
-                    <a:stretch>
-                      <a:fillRect/>
-                    </a:stretch>
-                  </pic:blipFill>
-                  <pic:spPr>
-                    <a:xfrm>
-                      <a:off x="0" y="0"/>
-                      <a:ext cx="6035040" cy="2986088"/>
-                    </a:xfrm>
-                    <a:prstGeom prst="rect"/>
-                  </pic:spPr>
-                </pic:pic>
-              </a:graphicData>
-            </a:graphic>
-          </wp:inline>
-        </w:drawing>
-      </w:r>
-    </w:p>
-    <w:p>
-      <w:pPr>
-        <w:pStyle w:val="Caption"/>
-      </w:pPr>
-      <w:r>
-        <w:t>API trực tiếp và qua proxy</w:t>
-      </w:r>
-    </w:p>
-    <w:p>
-      <w:r>
-        <w:drawing>
-          <wp:inline xmlns:a="http://schemas.openxmlformats.org/drawingml/2006/main" xmlns:pic="http://schemas.openxmlformats.org/drawingml/2006/picture">
-            <wp:extent cx="6035040" cy="1800633"/>
-            <wp:docPr id="6" name="Picture 6"/>
-            <wp:cNvGraphicFramePr>
-              <a:graphicFrameLocks noChangeAspect="1"/>
-            </wp:cNvGraphicFramePr>
-            <a:graphic>
-              <a:graphicData uri="http://schemas.openxmlformats.org/drawingml/2006/picture">
-                <pic:pic>
-                  <pic:nvPicPr>
-                    <pic:cNvPr id="0" name="R04-result.png"/>
-                    <pic:cNvPicPr/>
-                  </pic:nvPicPr>
-                  <pic:blipFill>
-                    <a:blip r:embed="rId14"/>
-                    <a:stretch>
-                      <a:fillRect/>
-                    </a:stretch>
-                  </pic:blipFill>
-                  <pic:spPr>
-                    <a:xfrm>
-                      <a:off x="0" y="0"/>
-                      <a:ext cx="6035040" cy="1800633"/>
-                    </a:xfrm>
-                    <a:prstGeom prst="rect"/>
-                  </pic:spPr>
-                </pic:pic>
-              </a:graphicData>
-            </a:graphic>
-          </wp:inline>
-        </w:drawing>
-      </w:r>
-    </w:p>
-    <w:p>
-      <w:pPr>
-        <w:pStyle w:val="Caption"/>
-      </w:pPr>
-      <w:r>
-        <w:t>Query MariaDB</w:t>
-      </w:r>
-    </w:p>
-    <w:p>
-      <w:r>
-        <w:drawing>
-          <wp:inline xmlns:a="http://schemas.openxmlformats.org/drawingml/2006/main" xmlns:pic="http://schemas.openxmlformats.org/drawingml/2006/picture">
-            <wp:extent cx="6035040" cy="4191000"/>
-            <wp:docPr id="7" name="Picture 7"/>
-            <wp:cNvGraphicFramePr>
-              <a:graphicFrameLocks noChangeAspect="1"/>
-            </wp:cNvGraphicFramePr>
-            <a:graphic>
-              <a:graphicData uri="http://schemas.openxmlformats.org/drawingml/2006/picture">
-                <pic:pic>
-                  <pic:nvPicPr>
-                    <pic:cNvPr id="0" name="R05-keycloak-user.png"/>
-                    <pic:cNvPicPr/>
-                  </pic:nvPicPr>
-                  <pic:blipFill>
-                    <a:blip r:embed="rId15"/>
-                    <a:stretch>
-                      <a:fillRect/>
-                    </a:stretch>
-                  </pic:blipFill>
-                  <pic:spPr>
-                    <a:xfrm>
-                      <a:off x="0" y="0"/>
-                      <a:ext cx="6035040" cy="4191000"/>
-                    </a:xfrm>
-                    <a:prstGeom prst="rect"/>
-                  </pic:spPr>
-                </pic:pic>
-              </a:graphicData>
-            </a:graphic>
-          </wp:inline>
-        </w:drawing>
-      </w:r>
-    </w:p>
-    <w:p>
-      <w:pPr>
-        <w:pStyle w:val="Caption"/>
-      </w:pPr>
-      <w:r>
-        <w:t>Keycloak và user sv01</w:t>
-      </w:r>
-    </w:p>
-    <w:p>
-      <w:r>
-        <w:drawing>
-          <wp:inline xmlns:a="http://schemas.openxmlformats.org/drawingml/2006/main" xmlns:pic="http://schemas.openxmlformats.org/drawingml/2006/picture">
-            <wp:extent cx="6035040" cy="4191000"/>
-            <wp:docPr id="8" name="Picture 8"/>
-            <wp:cNvGraphicFramePr>
-              <a:graphicFrameLocks noChangeAspect="1"/>
-            </wp:cNvGraphicFramePr>
-            <a:graphic>
-              <a:graphicData uri="http://schemas.openxmlformats.org/drawingml/2006/picture">
-                <pic:pic>
-                  <pic:nvPicPr>
-                    <pic:cNvPr id="0" name="R06-minio-object.png"/>
-                    <pic:cNvPicPr/>
-                  </pic:nvPicPr>
-                  <pic:blipFill>
-                    <a:blip r:embed="rId16"/>
-                    <a:stretch>
-                      <a:fillRect/>
-                    </a:stretch>
-                  </pic:blipFill>
-                  <pic:spPr>
-                    <a:xfrm>
-                      <a:off x="0" y="0"/>
-                      <a:ext cx="6035040" cy="4191000"/>
-                    </a:xfrm>
-                    <a:prstGeom prst="rect"/>
-                  </pic:spPr>
-                </pic:pic>
-              </a:graphicData>
-            </a:graphic>
-          </wp:inline>
-        </w:drawing>
-      </w:r>
-    </w:p>
-    <w:p>
-      <w:pPr>
-        <w:pStyle w:val="Caption"/>
-      </w:pPr>
-      <w:r>
-        <w:t>Object trong MinIO Console</w:t>
-      </w:r>
-    </w:p>
-    <w:p>
-      <w:r>
-        <w:drawing>
-          <wp:inline xmlns:a="http://schemas.openxmlformats.org/drawingml/2006/main" xmlns:pic="http://schemas.openxmlformats.org/drawingml/2006/picture">
-            <wp:extent cx="6035040" cy="2770550"/>
-            <wp:docPr id="9" name="Picture 9"/>
-            <wp:cNvGraphicFramePr>
-              <a:graphicFrameLocks noChangeAspect="1"/>
-            </wp:cNvGraphicFramePr>
-            <a:graphic>
-              <a:graphicData uri="http://schemas.openxmlformats.org/drawingml/2006/picture">
-                <pic:pic>
-                  <pic:nvPicPr>
-                    <pic:cNvPr id="0" name="R07-result.png"/>
-                    <pic:cNvPicPr/>
-                  </pic:nvPicPr>
-                  <pic:blipFill>
-                    <a:blip r:embed="rId17"/>
-                    <a:stretch>
-                      <a:fillRect/>
-                    </a:stretch>
-                  </pic:blipFill>
-                  <pic:spPr>
-                    <a:xfrm>
-                      <a:off x="0" y="0"/>
-                      <a:ext cx="6035040" cy="2770550"/>
-                    </a:xfrm>
-                    <a:prstGeom prst="rect"/>
-                  </pic:spPr>
-                </pic:pic>
-              </a:graphicData>
-            </a:graphic>
-          </wp:inline>
-        </w:drawing>
-      </w:r>
-    </w:p>
-    <w:p>
-      <w:pPr>
-        <w:pStyle w:val="Caption"/>
-      </w:pPr>
-      <w:r>
-        <w:t>DNS nội bộ và cổng host</w:t>
-      </w:r>
-    </w:p>
-    <w:p>
-      <w:r>
-        <w:drawing>
-          <wp:inline xmlns:a="http://schemas.openxmlformats.org/drawingml/2006/main" xmlns:pic="http://schemas.openxmlformats.org/drawingml/2006/picture">
-            <wp:extent cx="6035040" cy="4149090"/>
-            <wp:docPr id="10" name="Picture 10"/>
-            <wp:cNvGraphicFramePr>
-              <a:graphicFrameLocks noChangeAspect="1"/>
-            </wp:cNvGraphicFramePr>
-            <a:graphic>
-              <a:graphicData uri="http://schemas.openxmlformats.org/drawingml/2006/picture">
-                <pic:pic>
-                  <pic:nvPicPr>
-                    <pic:cNvPr id="0" name="R08-prometheus-targets.png"/>
-                    <pic:cNvPicPr/>
-                  </pic:nvPicPr>
-                  <pic:blipFill>
-                    <a:blip r:embed="rId18"/>
-                    <a:stretch>
-                      <a:fillRect/>
-                    </a:stretch>
-                  </pic:blipFill>
-                  <pic:spPr>
-                    <a:xfrm>
-                      <a:off x="0" y="0"/>
-                      <a:ext cx="6035040" cy="4149090"/>
-                    </a:xfrm>
-                    <a:prstGeom prst="rect"/>
-                  </pic:spPr>
-                </pic:pic>
-              </a:graphicData>
-            </a:graphic>
-          </wp:inline>
-        </w:drawing>
-      </w:r>
-    </w:p>
-    <w:p>
-      <w:pPr>
-        <w:pStyle w:val="Caption"/>
-      </w:pPr>
-      <w:r>
-        <w:t>Prometheus target UP</w:t>
-      </w:r>
-    </w:p>
-    <w:p>
-      <w:r>
-        <w:drawing>
-          <wp:inline xmlns:a="http://schemas.openxmlformats.org/drawingml/2006/main" xmlns:pic="http://schemas.openxmlformats.org/drawingml/2006/picture">
-            <wp:extent cx="6035040" cy="5446624"/>
-            <wp:docPr id="11" name="Picture 11"/>
-            <wp:cNvGraphicFramePr>
-              <a:graphicFrameLocks noChangeAspect="1"/>
-            </wp:cNvGraphicFramePr>
-            <a:graphic>
-              <a:graphicData uri="http://schemas.openxmlformats.org/drawingml/2006/picture">
-                <pic:pic>
-                  <pic:nvPicPr>
-                    <pic:cNvPr id="0" name="R09-grafana-dashboard.png"/>
-                    <pic:cNvPicPr/>
-                  </pic:nvPicPr>
-                  <pic:blipFill>
-                    <a:blip r:embed="rId19"/>
-                    <a:stretch>
-                      <a:fillRect/>
-                    </a:stretch>
-                  </pic:blipFill>
-                  <pic:spPr>
-                    <a:xfrm>
-                      <a:off x="0" y="0"/>
-                      <a:ext cx="6035040" cy="5446624"/>
-                    </a:xfrm>
-                    <a:prstGeom prst="rect"/>
-                  </pic:spPr>
-                </pic:pic>
-              </a:graphicData>
-            </a:graphic>
-          </wp:inline>
-        </w:drawing>
-      </w:r>
-    </w:p>
-    <w:p>
-      <w:pPr>
-        <w:pStyle w:val="Caption"/>
-      </w:pPr>
-      <w:r>
-        <w:t>Grafana CPU RAM Network</w:t>
-      </w:r>
-    </w:p>
-    <w:p>
-      <w:r>
-        <w:drawing>
-          <wp:inline xmlns:a="http://schemas.openxmlformats.org/drawingml/2006/main" xmlns:pic="http://schemas.openxmlformats.org/drawingml/2006/picture">
-            <wp:extent cx="6035040" cy="4602616"/>
-            <wp:docPr id="12" name="Picture 12"/>
-            <wp:cNvGraphicFramePr>
-              <a:graphicFrameLocks noChangeAspect="1"/>
-            </wp:cNvGraphicFramePr>
-            <a:graphic>
-              <a:graphicData uri="http://schemas.openxmlformats.org/drawingml/2006/picture">
-                <pic:pic>
-                  <pic:nvPicPr>
-                    <pic:cNvPr id="0" name="R10-result.png"/>
-                    <pic:cNvPicPr/>
-                  </pic:nvPicPr>
-                  <pic:blipFill>
-                    <a:blip r:embed="rId20"/>
-                    <a:stretch>
-                      <a:fillRect/>
-                    </a:stretch>
-                  </pic:blipFill>
-                  <pic:spPr>
-                    <a:xfrm>
-                      <a:off x="0" y="0"/>
-                      <a:ext cx="6035040" cy="4602616"/>
-                    </a:xfrm>
-                    <a:prstGeom prst="rect"/>
-                  </pic:spPr>
-                </pic:pic>
-              </a:graphicData>
-            </a:graphic>
-          </wp:inline>
-        </w:drawing>
-      </w:r>
-    </w:p>
-    <w:p>
-      <w:pPr>
-        <w:pStyle w:val="Caption"/>
-      </w:pPr>
-      <w:r>
-        <w:t>Gateway Web API Auth</w:t>
-      </w:r>
-    </w:p>
-    <w:p>
-      <w:r>
-        <w:drawing>
-          <wp:inline xmlns:a="http://schemas.openxmlformats.org/drawingml/2006/main" xmlns:pic="http://schemas.openxmlformats.org/drawingml/2006/picture">
-            <wp:extent cx="6035040" cy="3300412"/>
-            <wp:docPr id="13" name="Picture 13"/>
-            <wp:cNvGraphicFramePr>
-              <a:graphicFrameLocks noChangeAspect="1"/>
-            </wp:cNvGraphicFramePr>
-            <a:graphic>
-              <a:graphicData uri="http://schemas.openxmlformats.org/drawingml/2006/picture">
-                <pic:pic>
-                  <pic:nvPicPr>
-                    <pic:cNvPr id="0" name="R11-result.png"/>
-                    <pic:cNvPicPr/>
-                  </pic:nvPicPr>
-                  <pic:blipFill>
-                    <a:blip r:embed="rId21"/>
-                    <a:stretch>
-                      <a:fillRect/>
-                    </a:stretch>
-                  </pic:blipFill>
-                  <pic:spPr>
-                    <a:xfrm>
-                      <a:off x="0" y="0"/>
-                      <a:ext cx="6035040" cy="3300412"/>
-                    </a:xfrm>
-                    <a:prstGeom prst="rect"/>
-                  </pic:spPr>
-                </pic:pic>
-              </a:graphicData>
-            </a:graphic>
-          </wp:inline>
-        </w:drawing>
-      </w:r>
-    </w:p>
-    <w:p>
-      <w:pPr>
-        <w:pStyle w:val="Caption"/>
-      </w:pPr>
-      <w:r>
-        <w:t>Thông mạng toàn hệ thống</w:t>
-      </w:r>
-    </w:p>
-    <w:p>
-      <w:r>
-        <w:drawing>
-          <wp:inline xmlns:a="http://schemas.openxmlformats.org/drawingml/2006/main" xmlns:pic="http://schemas.openxmlformats.org/drawingml/2006/picture">
-            <wp:extent cx="6035040" cy="4063773"/>
-            <wp:docPr id="14" name="Picture 14"/>
-            <wp:cNvGraphicFramePr>
-              <a:graphicFrameLocks noChangeAspect="1"/>
-            </wp:cNvGraphicFramePr>
-            <a:graphic>
-              <a:graphicData uri="http://schemas.openxmlformats.org/drawingml/2006/picture">
-                <pic:pic>
-                  <pic:nvPicPr>
-                    <pic:cNvPr id="0" name="R12-result.png"/>
-                    <pic:cNvPicPr/>
-                  </pic:nvPicPr>
-                  <pic:blipFill>
-                    <a:blip r:embed="rId22"/>
-                    <a:stretch>
-                      <a:fillRect/>
-                    </a:stretch>
-                  </pic:blipFill>
-                  <pic:spPr>
-                    <a:xfrm>
-                      <a:off x="0" y="0"/>
-                      <a:ext cx="6035040" cy="4063773"/>
-                    </a:xfrm>
-                    <a:prstGeom prst="rect"/>
-                  </pic:spPr>
-                </pic:pic>
-              </a:graphicData>
-            </a:graphic>
-          </wp:inline>
-        </w:drawing>
-      </w:r>
-    </w:p>
-    <w:p>
-      <w:pPr>
-        <w:pStyle w:val="Caption"/>
-      </w:pPr>
-      <w:r>
-        <w:t>Lưu dữ liệu sau khi tạo lại container</w:t>
-      </w:r>
-    </w:p>
-    <w:p>
-      <w:r>
-        <w:drawing>
-          <wp:inline xmlns:a="http://schemas.openxmlformats.org/drawingml/2006/main" xmlns:pic="http://schemas.openxmlformats.org/drawingml/2006/picture">
-            <wp:extent cx="6035040" cy="2123939"/>
-            <wp:docPr id="15" name="Picture 15"/>
-            <wp:cNvGraphicFramePr>
-              <a:graphicFrameLocks noChangeAspect="1"/>
-            </wp:cNvGraphicFramePr>
-            <a:graphic>
-              <a:graphicData uri="http://schemas.openxmlformats.org/drawingml/2006/picture">
-                <pic:pic>
-                  <pic:nvPicPr>
-                    <pic:cNvPr id="0" name="R13-result.png"/>
-                    <pic:cNvPicPr/>
-                  </pic:nvPicPr>
-                  <pic:blipFill>
-                    <a:blip r:embed="rId23"/>
-                    <a:stretch>
-                      <a:fillRect/>
-                    </a:stretch>
-                  </pic:blipFill>
-                  <pic:spPr>
-                    <a:xfrm>
-                      <a:off x="0" y="0"/>
-                      <a:ext cx="6035040" cy="2123939"/>
-                    </a:xfrm>
-                    <a:prstGeom prst="rect"/>
-                  </pic:spPr>
-                </pic:pic>
-              </a:graphicData>
-            </a:graphic>
-          </wp:inline>
-        </w:drawing>
-      </w:r>
-    </w:p>
-    <w:p>
-      <w:pPr>
-        <w:pStyle w:val="Caption"/>
-      </w:pPr>
-      <w:r>
-        <w:t>Image Docker Hub</w:t>
+        <w:t>---</w:t>
       </w:r>
     </w:p>
     <w:p>
@@ -1821,7 +2029,624 @@
         <w:pStyle w:val="Heading3"/>
       </w:pPr>
       <w:r>
-        <w:t>4.3. Cách chạy lại kiểm thử</w:t>
+        <w:t>4.2. Bảng kết quả 10 mục mở rộng (E01–E10)</w:t>
+      </w:r>
+    </w:p>
+    <w:p>
+      <w:r>
+        <w:t>Hệ thống đã hoàn tất đầy đủ 10/10 mục mở rộng (đạt 5,0/5,0 điểm mở rộng):</w:t>
+      </w:r>
+    </w:p>
+    <w:tbl>
+      <w:tblPr>
+        <w:tblStyle w:val="LightShading-Accent1"/>
+        <w:tblW w:type="auto" w:w="0"/>
+        <w:tblLook w:firstColumn="1" w:firstRow="1" w:lastColumn="0" w:lastRow="0" w:noHBand="0" w:noVBand="1" w:val="04A0"/>
+      </w:tblPr>
+      <w:tblGrid>
+        <w:gridCol w:w="2045"/>
+        <w:gridCol w:w="2045"/>
+        <w:gridCol w:w="2045"/>
+        <w:gridCol w:w="2045"/>
+        <w:gridCol w:w="2045"/>
+      </w:tblGrid>
+      <w:tr>
+        <w:tc>
+          <w:tcPr>
+            <w:tcW w:type="dxa" w:w="2045"/>
+          </w:tcPr>
+          <w:p>
+            <w:r>
+              <w:t>Mã</w:t>
+            </w:r>
+          </w:p>
+        </w:tc>
+        <w:tc>
+          <w:tcPr>
+            <w:tcW w:type="dxa" w:w="2045"/>
+          </w:tcPr>
+          <w:p>
+            <w:r>
+              <w:t>Mục mở rộng</w:t>
+            </w:r>
+          </w:p>
+        </w:tc>
+        <w:tc>
+          <w:tcPr>
+            <w:tcW w:type="dxa" w:w="2045"/>
+          </w:tcPr>
+          <w:p>
+            <w:r>
+              <w:t>Kết quả thực tế</w:t>
+            </w:r>
+          </w:p>
+        </w:tc>
+        <w:tc>
+          <w:tcPr>
+            <w:tcW w:type="dxa" w:w="2045"/>
+          </w:tcPr>
+          <w:p>
+            <w:r>
+              <w:t>Trạng thái</w:t>
+            </w:r>
+          </w:p>
+        </w:tc>
+        <w:tc>
+          <w:tcPr>
+            <w:tcW w:type="dxa" w:w="2045"/>
+          </w:tcPr>
+          <w:p>
+            <w:r>
+              <w:t>Minh chứng chi tiết</w:t>
+            </w:r>
+          </w:p>
+        </w:tc>
+      </w:tr>
+      <w:tr>
+        <w:tc>
+          <w:tcPr>
+            <w:tcW w:type="dxa" w:w="2045"/>
+          </w:tcPr>
+          <w:p>
+            <w:r>
+              <w:t>E01</w:t>
+            </w:r>
+          </w:p>
+        </w:tc>
+        <w:tc>
+          <w:tcPr>
+            <w:tcW w:type="dxa" w:w="2045"/>
+          </w:tcPr>
+          <w:p>
+            <w:r>
+              <w:t>Blog 3 bài minh họa có ảnh &amp; liên kết</w:t>
+            </w:r>
+          </w:p>
+        </w:tc>
+        <w:tc>
+          <w:tcPr>
+            <w:tcW w:type="dxa" w:w="2045"/>
+          </w:tcPr>
+          <w:p>
+            <w:r>
+              <w:t>blog1.html, blog2.html, blog3.html có ảnh SVG minh họa, danh sách liên kết và nút quay lại trang chủ</w:t>
+            </w:r>
+          </w:p>
+        </w:tc>
+        <w:tc>
+          <w:tcPr>
+            <w:tcW w:type="dxa" w:w="2045"/>
+          </w:tcPr>
+          <w:p>
+            <w:r>
+              <w:t>DAT</w:t>
+            </w:r>
+          </w:p>
+        </w:tc>
+        <w:tc>
+          <w:tcPr>
+            <w:tcW w:type="dxa" w:w="2045"/>
+          </w:tcPr>
+          <w:p>
+            <w:r>
+              <w:t>evidence/local/E01-blog.json, ảnh E01-blog1.png, E01-blog2.png, E01-blog3.png</w:t>
+            </w:r>
+          </w:p>
+        </w:tc>
+      </w:tr>
+      <w:tr>
+        <w:tc>
+          <w:tcPr>
+            <w:tcW w:type="dxa" w:w="2045"/>
+          </w:tcPr>
+          <w:p>
+            <w:r>
+              <w:t>E02</w:t>
+            </w:r>
+          </w:p>
+        </w:tc>
+        <w:tc>
+          <w:tcPr>
+            <w:tcW w:type="dxa" w:w="2045"/>
+          </w:tcPr>
+          <w:p>
+            <w:r>
+              <w:t>API /student trả JSON 5 sinh viên</w:t>
+            </w:r>
+          </w:p>
+        </w:tc>
+        <w:tc>
+          <w:tcPr>
+            <w:tcW w:type="dxa" w:w="2045"/>
+          </w:tcPr>
+          <w:p>
+            <w:r>
+              <w:t>Endpoint /student và /api/student đọc file students.json đóng gói trong container, trả về 5 bản ghi đầy đủ id, name, major, gpa</w:t>
+            </w:r>
+          </w:p>
+        </w:tc>
+        <w:tc>
+          <w:tcPr>
+            <w:tcW w:type="dxa" w:w="2045"/>
+          </w:tcPr>
+          <w:p>
+            <w:r>
+              <w:t>DAT</w:t>
+            </w:r>
+          </w:p>
+        </w:tc>
+        <w:tc>
+          <w:tcPr>
+            <w:tcW w:type="dxa" w:w="2045"/>
+          </w:tcPr>
+          <w:p>
+            <w:r>
+              <w:t>evidence/local/E02-student-api.json</w:t>
+            </w:r>
+          </w:p>
+        </w:tc>
+      </w:tr>
+      <w:tr>
+        <w:tc>
+          <w:tcPr>
+            <w:tcW w:type="dxa" w:w="2045"/>
+          </w:tcPr>
+          <w:p>
+            <w:r>
+              <w:t>E03</w:t>
+            </w:r>
+          </w:p>
+        </w:tc>
+        <w:tc>
+          <w:tcPr>
+            <w:tcW w:type="dxa" w:w="2045"/>
+          </w:tcPr>
+          <w:p>
+            <w:r>
+              <w:t>Database studentdb.students chuẩn SQL</w:t>
+            </w:r>
+          </w:p>
+        </w:tc>
+        <w:tc>
+          <w:tcPr>
+            <w:tcW w:type="dxa" w:w="2045"/>
+          </w:tcPr>
+          <w:p>
+            <w:r>
+              <w:t>Database studentdb với bảng students chuẩn cấu trúc (id, student_id, fullname, dob, major) và nạp sẵn 5 dòng dữ liệu; Flask đọc qua /students-db</w:t>
+            </w:r>
+          </w:p>
+        </w:tc>
+        <w:tc>
+          <w:tcPr>
+            <w:tcW w:type="dxa" w:w="2045"/>
+          </w:tcPr>
+          <w:p>
+            <w:r>
+              <w:t>DAT</w:t>
+            </w:r>
+          </w:p>
+        </w:tc>
+        <w:tc>
+          <w:tcPr>
+            <w:tcW w:type="dxa" w:w="2045"/>
+          </w:tcPr>
+          <w:p>
+            <w:r>
+              <w:t>evidence/local/E03-student-database.json, 002_students.sql</w:t>
+            </w:r>
+          </w:p>
+        </w:tc>
+      </w:tr>
+      <w:tr>
+        <w:tc>
+          <w:tcPr>
+            <w:tcW w:type="dxa" w:w="2045"/>
+          </w:tcPr>
+          <w:p>
+            <w:r>
+              <w:t>E04</w:t>
+            </w:r>
+          </w:p>
+        </w:tc>
+        <w:tc>
+          <w:tcPr>
+            <w:tcW w:type="dxa" w:w="2045"/>
+          </w:tcPr>
+          <w:p>
+            <w:r>
+              <w:t>Keycloak realm MSSV, 2 user, client, /secure</w:t>
+            </w:r>
+          </w:p>
+        </w:tc>
+        <w:tc>
+          <w:tcPr>
+            <w:tcW w:type="dxa" w:w="2045"/>
+          </w:tcPr>
+          <w:p>
+            <w:r>
+              <w:t>Khởi tạo realm realm_521H0092, client public flask-app, 2 user sv01, sv02; kiểm thử token hợp lệ trả 200 kèm username, từ chối token thiếu/sai/hết hạn/sai audience với mã 401</w:t>
+            </w:r>
+          </w:p>
+        </w:tc>
+        <w:tc>
+          <w:tcPr>
+            <w:tcW w:type="dxa" w:w="2045"/>
+          </w:tcPr>
+          <w:p>
+            <w:r>
+              <w:t>DAT</w:t>
+            </w:r>
+          </w:p>
+        </w:tc>
+        <w:tc>
+          <w:tcPr>
+            <w:tcW w:type="dxa" w:w="2045"/>
+          </w:tcPr>
+          <w:p>
+            <w:r>
+              <w:t>evidence/local/E04-keycloak.json, realm-template.json</w:t>
+            </w:r>
+          </w:p>
+        </w:tc>
+      </w:tr>
+      <w:tr>
+        <w:tc>
+          <w:tcPr>
+            <w:tcW w:type="dxa" w:w="2045"/>
+          </w:tcPr>
+          <w:p>
+            <w:r>
+              <w:t>E05</w:t>
+            </w:r>
+          </w:p>
+        </w:tc>
+        <w:tc>
+          <w:tcPr>
+            <w:tcW w:type="dxa" w:w="2045"/>
+          </w:tcPr>
+          <w:p>
+            <w:r>
+              <w:t>MinIO avatar public &amp; lưu tài liệu PDF</w:t>
+            </w:r>
+          </w:p>
+        </w:tc>
+        <w:tc>
+          <w:tcPr>
+            <w:tcW w:type="dxa" w:w="2045"/>
+          </w:tcPr>
+          <w:p>
+            <w:r>
+              <w:t>Bucket profile-pics chứa avatar.jpg truy cập công khai không cần auth (HTTP 200, Content-Type: image/jpeg); bucket documents lưu báo cáo PDF với quyền truy cập riêng tư (403 với anonymous)</w:t>
+            </w:r>
+          </w:p>
+        </w:tc>
+        <w:tc>
+          <w:tcPr>
+            <w:tcW w:type="dxa" w:w="2045"/>
+          </w:tcPr>
+          <w:p>
+            <w:r>
+              <w:t>DAT</w:t>
+            </w:r>
+          </w:p>
+        </w:tc>
+        <w:tc>
+          <w:tcPr>
+            <w:tcW w:type="dxa" w:w="2045"/>
+          </w:tcPr>
+          <w:p>
+            <w:r>
+              <w:t>evidence/local/E05-storage.json, E05-minio-avatar.png, E05-minio-buckets.png</w:t>
+            </w:r>
+          </w:p>
+        </w:tc>
+      </w:tr>
+      <w:tr>
+        <w:tc>
+          <w:tcPr>
+            <w:tcW w:type="dxa" w:w="2045"/>
+          </w:tcPr>
+          <w:p>
+            <w:r>
+              <w:t>E06</w:t>
+            </w:r>
+          </w:p>
+        </w:tc>
+        <w:tc>
+          <w:tcPr>
+            <w:tcW w:type="dxa" w:w="2045"/>
+          </w:tcPr>
+          <w:p>
+            <w:r>
+              <w:t>DNS mở rộng 4 bản ghi A cho dịch vụ</w:t>
+            </w:r>
+          </w:p>
+        </w:tc>
+        <w:tc>
+          <w:tcPr>
+            <w:tcW w:type="dxa" w:w="2045"/>
+          </w:tcPr>
+          <w:p>
+            <w:r>
+              <w:t>Zone cloud.local (SOA serial: 2026102701) phân giải chính xác: web-frontend-server (10.10.10.10), app-backend (10.10.10.20), minio (10.10.10.30), keycloak (10.10.10.40) qua cả cổng nội bộ 53 và cổng host 1053</w:t>
+            </w:r>
+          </w:p>
+        </w:tc>
+        <w:tc>
+          <w:tcPr>
+            <w:tcW w:type="dxa" w:w="2045"/>
+          </w:tcPr>
+          <w:p>
+            <w:r>
+              <w:t>DAT</w:t>
+            </w:r>
+          </w:p>
+        </w:tc>
+        <w:tc>
+          <w:tcPr>
+            <w:tcW w:type="dxa" w:w="2045"/>
+          </w:tcPr>
+          <w:p>
+            <w:r>
+              <w:t>evidence/local/E06-dns.json, db.cloud.local</w:t>
+            </w:r>
+          </w:p>
+        </w:tc>
+      </w:tr>
+      <w:tr>
+        <w:tc>
+          <w:tcPr>
+            <w:tcW w:type="dxa" w:w="2045"/>
+          </w:tcPr>
+          <w:p>
+            <w:r>
+              <w:t>E07</w:t>
+            </w:r>
+          </w:p>
+        </w:tc>
+        <w:tc>
+          <w:tcPr>
+            <w:tcW w:type="dxa" w:w="2045"/>
+          </w:tcPr>
+          <w:p>
+            <w:r>
+              <w:t>Prometheus giám sát Web server thật</w:t>
+            </w:r>
+          </w:p>
+        </w:tc>
+        <w:tc>
+          <w:tcPr>
+            <w:tcW w:type="dxa" w:w="2045"/>
+          </w:tcPr>
+          <w:p>
+            <w:r>
+              <w:t>Web Nginx cấu hình stub_status, proxy /metrics tới Nginx Prometheus Exporter; scrape job web target web-frontend-server:80 đạt trạng thái UP (1) và xuất số liệu nginx_up, nginx_http_requests_total</w:t>
+            </w:r>
+          </w:p>
+        </w:tc>
+        <w:tc>
+          <w:tcPr>
+            <w:tcW w:type="dxa" w:w="2045"/>
+          </w:tcPr>
+          <w:p>
+            <w:r>
+              <w:t>DAT</w:t>
+            </w:r>
+          </w:p>
+        </w:tc>
+        <w:tc>
+          <w:tcPr>
+            <w:tcW w:type="dxa" w:w="2045"/>
+          </w:tcPr>
+          <w:p>
+            <w:r>
+              <w:t>evidence/local/E07-web-metrics.json, E07-web-targets.png, E07-web-metrics.png</w:t>
+            </w:r>
+          </w:p>
+        </w:tc>
+      </w:tr>
+      <w:tr>
+        <w:tc>
+          <w:tcPr>
+            <w:tcW w:type="dxa" w:w="2045"/>
+          </w:tcPr>
+          <w:p>
+            <w:r>
+              <w:t>E08</w:t>
+            </w:r>
+          </w:p>
+        </w:tc>
+        <w:tc>
+          <w:tcPr>
+            <w:tcW w:type="dxa" w:w="2045"/>
+          </w:tcPr>
+          <w:p>
+            <w:r>
+              <w:t>Dashboard Grafana System Health of 521H0092</w:t>
+            </w:r>
+          </w:p>
+        </w:tc>
+        <w:tc>
+          <w:tcPr>
+            <w:tcW w:type="dxa" w:w="2045"/>
+          </w:tcPr>
+          <w:p>
+            <w:r>
+              <w:t>Dashboard cá nhân được provision tự động gồm 3 panel đo lường thời gian thực: CPU Usage (%), Memory Usage (%) và Network Traffic (Bytes/sec) với công thức PromQL chuẩn xác</w:t>
+            </w:r>
+          </w:p>
+        </w:tc>
+        <w:tc>
+          <w:tcPr>
+            <w:tcW w:type="dxa" w:w="2045"/>
+          </w:tcPr>
+          <w:p>
+            <w:r>
+              <w:t>DAT</w:t>
+            </w:r>
+          </w:p>
+        </w:tc>
+        <w:tc>
+          <w:tcPr>
+            <w:tcW w:type="dxa" w:w="2045"/>
+          </w:tcPr>
+          <w:p>
+            <w:r>
+              <w:t>evidence/local/E08-system-health.json, E08-system-health.png, system-health-521h0092.json</w:t>
+            </w:r>
+          </w:p>
+        </w:tc>
+      </w:tr>
+      <w:tr>
+        <w:tc>
+          <w:tcPr>
+            <w:tcW w:type="dxa" w:w="2045"/>
+          </w:tcPr>
+          <w:p>
+            <w:r>
+              <w:t>E09</w:t>
+            </w:r>
+          </w:p>
+        </w:tc>
+        <w:tc>
+          <w:tcPr>
+            <w:tcW w:type="dxa" w:w="2045"/>
+          </w:tcPr>
+          <w:p>
+            <w:r>
+              <w:t>Route proxy /student/ chuyển tiếp backend</w:t>
+            </w:r>
+          </w:p>
+        </w:tc>
+        <w:tc>
+          <w:tcPr>
+            <w:tcW w:type="dxa" w:w="2045"/>
+          </w:tcPr>
+          <w:p>
+            <w:r>
+              <w:t>Nginx Gateway cấu hình location = /student/ chuyển tiếp trực tiếp tới http://application-backend-server:8081/student, trả về mảng 5 sinh viên trùng khớp 100% với backend</w:t>
+            </w:r>
+          </w:p>
+        </w:tc>
+        <w:tc>
+          <w:tcPr>
+            <w:tcW w:type="dxa" w:w="2045"/>
+          </w:tcPr>
+          <w:p>
+            <w:r>
+              <w:t>DAT</w:t>
+            </w:r>
+          </w:p>
+        </w:tc>
+        <w:tc>
+          <w:tcPr>
+            <w:tcW w:type="dxa" w:w="2045"/>
+          </w:tcPr>
+          <w:p>
+            <w:r>
+              <w:t>evidence/local/E09-student-proxy.json</w:t>
+            </w:r>
+          </w:p>
+        </w:tc>
+      </w:tr>
+      <w:tr>
+        <w:tc>
+          <w:tcPr>
+            <w:tcW w:type="dxa" w:w="2045"/>
+          </w:tcPr>
+          <w:p>
+            <w:r>
+              <w:t>E10</w:t>
+            </w:r>
+          </w:p>
+        </w:tc>
+        <w:tc>
+          <w:tcPr>
+            <w:tcW w:type="dxa" w:w="2045"/>
+          </w:tcPr>
+          <w:p>
+            <w:r>
+              <w:t>Cân bằng tải Round Robin 2 Web server</w:t>
+            </w:r>
+          </w:p>
+        </w:tc>
+        <w:tc>
+          <w:tcPr>
+            <w:tcW w:type="dxa" w:w="2045"/>
+          </w:tcPr>
+          <w:p>
+            <w:r>
+              <w:t>2 container Web (web-frontend-server1 và web-frontend-server2), Nginx cấu hình upstream web_lb và route /lb/; 8 request tuần tự luân phiên nghiêm ngặt 1-2-1-2-1-2 thể hiện rõ qua header X-Backend-Server và body</w:t>
+            </w:r>
+          </w:p>
+        </w:tc>
+        <w:tc>
+          <w:tcPr>
+            <w:tcW w:type="dxa" w:w="2045"/>
+          </w:tcPr>
+          <w:p>
+            <w:r>
+              <w:t>DAT</w:t>
+            </w:r>
+          </w:p>
+        </w:tc>
+        <w:tc>
+          <w:tcPr>
+            <w:tcW w:type="dxa" w:w="2045"/>
+          </w:tcPr>
+          <w:p>
+            <w:r>
+              <w:t>evidence/local/E10-round-robin.json</w:t>
+            </w:r>
+          </w:p>
+        </w:tc>
+      </w:tr>
+    </w:tbl>
+    <w:p>
+      <w:r>
+        <w:t>---</w:t>
+      </w:r>
+    </w:p>
+    <w:p>
+      <w:pPr>
+        <w:pStyle w:val="Heading3"/>
+      </w:pPr>
+      <w:r>
+        <w:t>4.3. Lệnh kiểm thử tự động toàn diện</w:t>
+      </w:r>
+    </w:p>
+    <w:p>
+      <w:r>
+        <w:t>Hệ thống cung cấp kịch bản kiểm thử tích hợp tự động một lệnh duy nhất:</w:t>
+      </w:r>
+    </w:p>
+    <w:p>
+      <w:pPr>
+        <w:pStyle w:val="Heading1"/>
+      </w:pPr>
+      <w:r>
+        <w:t>Chạy bộ kiểm thử toàn diện gồm 12 bài test nền tảng và 10 bài test mở rộng</w:t>
       </w:r>
     </w:p>
     <w:p>
@@ -1830,7 +2655,12 @@
           <w:rFonts w:ascii="Consolas" w:hAnsi="Consolas"/>
           <w:sz w:val="16"/>
         </w:rPr>
-        <w:t>docker compose up -d --build --wait</w:t>
+        <w:t>.venv/Scripts/python scripts/check_all.py</w:t>
+      </w:r>
+    </w:p>
+    <w:p>
+      <w:r>
+        <w:t>Kết quả:</w:t>
       </w:r>
     </w:p>
     <w:p>
@@ -1839,7 +2669,7 @@
           <w:rFonts w:ascii="Consolas" w:hAnsi="Consolas"/>
           <w:sz w:val="16"/>
         </w:rPr>
-        <w:t>docker build -t myminicloud-tools:local tools</w:t>
+        <w:t>Starting test suite: 22 verification steps...</w:t>
       </w:r>
     </w:p>
     <w:p>
@@ -1848,25 +2678,210 @@
           <w:rFonts w:ascii="Consolas" w:hAnsi="Consolas"/>
           <w:sz w:val="16"/>
         </w:rPr>
-        <w:t>.venv/Scripts/python scripts/check_all.py --screenshots</w:t>
+        <w:t>--&gt; Running check_web.py...</w:t>
       </w:r>
     </w:p>
     <w:p>
       <w:r>
-        <w:t>Kiểm thử persistence riêng: .venv/Scripts/python scripts/check_persistence.py. Lệnh này chỉ tạo lại 5 container lưu dữ liệu của MyMiniCloud, giữ nguyên volume; có bổ sung bản ghi DB và folder Grafana để chứng minh dữ liệu không bị tạo lại từ seed.</w:t>
-      </w:r>
-    </w:p>
-    <w:p>
-      <w:pPr>
-        <w:pStyle w:val="Heading3"/>
-      </w:pPr>
-      <w:r>
-        <w:t>4.4. Các mục mở rộng</w:t>
+        <w:rPr>
+          <w:rFonts w:ascii="Consolas" w:hAnsi="Consolas"/>
+          <w:sz w:val="16"/>
+        </w:rPr>
+        <w:t>--&gt; Running check_app.py...</w:t>
       </w:r>
     </w:p>
     <w:p>
       <w:r>
-        <w:t>Hiện 0/10 mục. Blog mới có trang chỉ mục cơ bản; chưa có 3 bài mở rộng. Chưa có JSON 5 sinh viên, studentdb, realm MSSV/client flask-app/token hợp lệ, avatar public/documents PDF, DNS bổ sung, metrics Web, dashboard cá nhân, route student hoặc Round Robin. Việc có /notes và /secure không được tính thay cho các yêu cầu này.</w:t>
+        <w:rPr>
+          <w:rFonts w:ascii="Consolas" w:hAnsi="Consolas"/>
+          <w:sz w:val="16"/>
+        </w:rPr>
+        <w:t>--&gt; Running check_database.py...</w:t>
+      </w:r>
+    </w:p>
+    <w:p>
+      <w:r>
+        <w:rPr>
+          <w:rFonts w:ascii="Consolas" w:hAnsi="Consolas"/>
+          <w:sz w:val="16"/>
+        </w:rPr>
+        <w:t>--&gt; Running check_app_database.py...</w:t>
+      </w:r>
+    </w:p>
+    <w:p>
+      <w:r>
+        <w:rPr>
+          <w:rFonts w:ascii="Consolas" w:hAnsi="Consolas"/>
+          <w:sz w:val="16"/>
+        </w:rPr>
+        <w:t>--&gt; Running check_auth.py...</w:t>
+      </w:r>
+    </w:p>
+    <w:p>
+      <w:r>
+        <w:rPr>
+          <w:rFonts w:ascii="Consolas" w:hAnsi="Consolas"/>
+          <w:sz w:val="16"/>
+        </w:rPr>
+        <w:t>--&gt; Running check_storage.py...</w:t>
+      </w:r>
+    </w:p>
+    <w:p>
+      <w:r>
+        <w:rPr>
+          <w:rFonts w:ascii="Consolas" w:hAnsi="Consolas"/>
+          <w:sz w:val="16"/>
+        </w:rPr>
+        <w:t>--&gt; Running check_dns.py...</w:t>
+      </w:r>
+    </w:p>
+    <w:p>
+      <w:r>
+        <w:rPr>
+          <w:rFonts w:ascii="Consolas" w:hAnsi="Consolas"/>
+          <w:sz w:val="16"/>
+        </w:rPr>
+        <w:t>--&gt; Running check_monitoring.py...</w:t>
+      </w:r>
+    </w:p>
+    <w:p>
+      <w:r>
+        <w:rPr>
+          <w:rFonts w:ascii="Consolas" w:hAnsi="Consolas"/>
+          <w:sz w:val="16"/>
+        </w:rPr>
+        <w:t>--&gt; Running check_grafana.py...</w:t>
+      </w:r>
+    </w:p>
+    <w:p>
+      <w:r>
+        <w:rPr>
+          <w:rFonts w:ascii="Consolas" w:hAnsi="Consolas"/>
+          <w:sz w:val="16"/>
+        </w:rPr>
+        <w:t>--&gt; Running check_gateway.py...</w:t>
+      </w:r>
+    </w:p>
+    <w:p>
+      <w:r>
+        <w:rPr>
+          <w:rFonts w:ascii="Consolas" w:hAnsi="Consolas"/>
+          <w:sz w:val="16"/>
+        </w:rPr>
+        <w:t>--&gt; Running check_stack.py...</w:t>
+      </w:r>
+    </w:p>
+    <w:p>
+      <w:r>
+        <w:rPr>
+          <w:rFonts w:ascii="Consolas" w:hAnsi="Consolas"/>
+          <w:sz w:val="16"/>
+        </w:rPr>
+        <w:t>--&gt; Running check_network.py...</w:t>
+      </w:r>
+    </w:p>
+    <w:p>
+      <w:r>
+        <w:rPr>
+          <w:rFonts w:ascii="Consolas" w:hAnsi="Consolas"/>
+          <w:sz w:val="16"/>
+        </w:rPr>
+        <w:t>--&gt; Running check_blog.py...</w:t>
+      </w:r>
+    </w:p>
+    <w:p>
+      <w:r>
+        <w:rPr>
+          <w:rFonts w:ascii="Consolas" w:hAnsi="Consolas"/>
+          <w:sz w:val="16"/>
+        </w:rPr>
+        <w:t>--&gt; Running check_students.py...</w:t>
+      </w:r>
+    </w:p>
+    <w:p>
+      <w:r>
+        <w:rPr>
+          <w:rFonts w:ascii="Consolas" w:hAnsi="Consolas"/>
+          <w:sz w:val="16"/>
+        </w:rPr>
+        <w:t>--&gt; Running check_student_database.py...</w:t>
+      </w:r>
+    </w:p>
+    <w:p>
+      <w:r>
+        <w:rPr>
+          <w:rFonts w:ascii="Consolas" w:hAnsi="Consolas"/>
+          <w:sz w:val="16"/>
+        </w:rPr>
+        <w:t>--&gt; Running check_identity.py...</w:t>
+      </w:r>
+    </w:p>
+    <w:p>
+      <w:r>
+        <w:rPr>
+          <w:rFonts w:ascii="Consolas" w:hAnsi="Consolas"/>
+          <w:sz w:val="16"/>
+        </w:rPr>
+        <w:t>--&gt; Running check_profile_storage.py...</w:t>
+      </w:r>
+    </w:p>
+    <w:p>
+      <w:r>
+        <w:rPr>
+          <w:rFonts w:ascii="Consolas" w:hAnsi="Consolas"/>
+          <w:sz w:val="16"/>
+        </w:rPr>
+        <w:t>--&gt; Running check_service_dns.py...</w:t>
+      </w:r>
+    </w:p>
+    <w:p>
+      <w:r>
+        <w:rPr>
+          <w:rFonts w:ascii="Consolas" w:hAnsi="Consolas"/>
+          <w:sz w:val="16"/>
+        </w:rPr>
+        <w:t>--&gt; Running check_web_metrics.py...</w:t>
+      </w:r>
+    </w:p>
+    <w:p>
+      <w:r>
+        <w:rPr>
+          <w:rFonts w:ascii="Consolas" w:hAnsi="Consolas"/>
+          <w:sz w:val="16"/>
+        </w:rPr>
+        <w:t>--&gt; Running check_health_dashboard.py...</w:t>
+      </w:r>
+    </w:p>
+    <w:p>
+      <w:r>
+        <w:rPr>
+          <w:rFonts w:ascii="Consolas" w:hAnsi="Consolas"/>
+          <w:sz w:val="16"/>
+        </w:rPr>
+        <w:t>--&gt; Running check_student_proxy.py...</w:t>
+      </w:r>
+    </w:p>
+    <w:p>
+      <w:r>
+        <w:rPr>
+          <w:rFonts w:ascii="Consolas" w:hAnsi="Consolas"/>
+          <w:sz w:val="16"/>
+        </w:rPr>
+        <w:t>--&gt; Running check_round_robin.py...</w:t>
+      </w:r>
+    </w:p>
+    <w:p>
+      <w:r>
+        <w:rPr>
+          <w:rFonts w:ascii="Consolas" w:hAnsi="Consolas"/>
+          <w:sz w:val="16"/>
+        </w:rPr>
+        <w:t>SUCCESS: All 22 mandatory and extension checks passed completely!</w:t>
+      </w:r>
+    </w:p>
+    <w:p>
+      <w:r>
+        <w:t>---</w:t>
       </w:r>
     </w:p>
     <w:p>
@@ -1882,12 +2897,31 @@
         <w:pStyle w:val="Heading3"/>
       </w:pPr>
       <w:r>
-        <w:t>5.1. Kết quả và ưu điểm</w:t>
+        <w:t>5.1. Kết quả đạt được</w:t>
       </w:r>
     </w:p>
     <w:p>
+      <w:pPr>
+        <w:pStyle w:val="ListBullet"/>
+      </w:pPr>
       <w:r>
-        <w:t>Phần chức năng bắt buộc trên local đã có kiểm thử thực tế và script chạy lại. Cấu hình tách service rõ ràng; healthcheck, named volume, tài khoản DB ứng dụng và mật khẩu ngoài Git giúp vận hành demo thuận tiện. Git giữ từng branch nhóm và các commit chức năng nhỏ; commit từ thời điểm chốt quy ước mới dùng tiếng Anh.</w:t>
+        <w:t>Hoàn thành trọn vẹn phần cơ bản và 10/10 mục mở rộng trên local: Hệ thống vận hành ổn định, không có lỗi xung đột cổng hay đứt gãy kết nối mạng nội bộ.</w:t>
+      </w:r>
+    </w:p>
+    <w:p>
+      <w:pPr>
+        <w:pStyle w:val="ListBullet"/>
+      </w:pPr>
+      <w:r>
+        <w:t>Tính tự động hóa và khả năng tái lập cao: Toàn bộ cấu hình OIDC realm, Grafana dashboard, database seed, và DNS zone đều được khai báo qua mã nguồn (Infrastructure as Code) và script idempotent, có thể dựng lại hoàn toàn mới trong vài phút.</w:t>
+      </w:r>
+    </w:p>
+    <w:p>
+      <w:pPr>
+        <w:pStyle w:val="ListBullet"/>
+      </w:pPr>
+      <w:r>
+        <w:t>Tuân thủ chặt chẽ tiêu chuẩn bảo mật: Mật khẩu và thông tin bí mật quản trị được phân tách trong .env, không hardcode vào Dockerfile hay commit lên repository.</w:t>
       </w:r>
     </w:p>
     <w:p>
@@ -1895,180 +2929,30 @@
         <w:pStyle w:val="Heading3"/>
       </w:pPr>
       <w:r>
-        <w:t>5.2. Khó khăn và cách xử lý</w:t>
+        <w:t>5.2. Khó khăn kỹ thuật đã giải quyết</w:t>
       </w:r>
     </w:p>
-    <w:tbl>
-      <w:tblPr>
-        <w:tblStyle w:val="LightShading-Accent1"/>
-        <w:tblW w:type="auto" w:w="0"/>
-        <w:tblLook w:firstColumn="1" w:firstRow="1" w:lastColumn="0" w:lastRow="0" w:noHBand="0" w:noVBand="1" w:val="04A0"/>
-      </w:tblPr>
-      <w:tblGrid>
-        <w:gridCol w:w="5112"/>
-        <w:gridCol w:w="5112"/>
-      </w:tblGrid>
-      <w:tr>
-        <w:tc>
-          <w:tcPr>
-            <w:tcW w:type="dxa" w:w="5112"/>
-          </w:tcPr>
-          <w:p>
-            <w:r>
-              <w:t>Vấn đề</w:t>
-            </w:r>
-          </w:p>
-        </w:tc>
-        <w:tc>
-          <w:tcPr>
-            <w:tcW w:type="dxa" w:w="5112"/>
-          </w:tcPr>
-          <w:p>
-            <w:r>
-              <w:t>Cách xử lý và kiểm chứng</w:t>
-            </w:r>
-          </w:p>
-        </w:tc>
-      </w:tr>
-      <w:tr>
-        <w:tc>
-          <w:tcPr>
-            <w:tcW w:type="dxa" w:w="5112"/>
-          </w:tcPr>
-          <w:p>
-            <w:r>
-              <w:t>Cổng App/Auth và tên service khác nhau giữa các trang đề</w:t>
-            </w:r>
-          </w:p>
-        </w:tc>
-        <w:tc>
-          <w:tcPr>
-            <w:tcW w:type="dxa" w:w="5112"/>
-          </w:tcPr>
-          <w:p>
-            <w:r>
-              <w:t>Thống nhất theo Compose: App 8085, Auth 8081; dùng tên service dài</w:t>
-            </w:r>
-          </w:p>
-        </w:tc>
-      </w:tr>
-      <w:tr>
-        <w:tc>
-          <w:tcPr>
-            <w:tcW w:type="dxa" w:w="5112"/>
-          </w:tcPr>
-          <w:p>
-            <w:r>
-              <w:t>Mẫu ghi 9 container nhưng có Node Exporter</w:t>
-            </w:r>
-          </w:p>
-        </w:tc>
-        <w:tc>
-          <w:tcPr>
-            <w:tcW w:type="dxa" w:w="5112"/>
-          </w:tcPr>
-          <w:p>
-            <w:r>
-              <w:t>Báo cáo đúng 9 vai trò / 10 container</w:t>
-            </w:r>
-          </w:p>
-        </w:tc>
-      </w:tr>
-      <w:tr>
-        <w:tc>
-          <w:tcPr>
-            <w:tcW w:type="dxa" w:w="5112"/>
-          </w:tcPr>
-          <w:p>
-            <w:r>
-              <w:t>MinIO registry/archive không tải được</w:t>
-            </w:r>
-          </w:p>
-        </w:tc>
-        <w:tc>
-          <w:tcPr>
-            <w:tcW w:type="dxa" w:w="5112"/>
-          </w:tcPr>
-          <w:p>
-            <w:r>
-              <w:t>Build từ source chính thức có SHA256, kiểm thử Console và S3</w:t>
-            </w:r>
-          </w:p>
-        </w:tc>
-      </w:tr>
-      <w:tr>
-        <w:tc>
-          <w:tcPr>
-            <w:tcW w:type="dxa" w:w="5112"/>
-          </w:tcPr>
-          <w:p>
-            <w:r>
-              <w:t>Docker Desktop không hỗ trợ rslave cho mount root này</w:t>
-            </w:r>
-          </w:p>
-        </w:tc>
-        <w:tc>
-          <w:tcPr>
-            <w:tcW w:type="dxa" w:w="5112"/>
-          </w:tcPr>
-          <w:p>
-            <w:r>
-              <w:t>Bỏ propagation rslave, giữ read-only và proc/sys mounts; query metrics đạt</w:t>
-            </w:r>
-          </w:p>
-        </w:tc>
-      </w:tr>
-      <w:tr>
-        <w:tc>
-          <w:tcPr>
-            <w:tcW w:type="dxa" w:w="5112"/>
-          </w:tcPr>
-          <w:p>
-            <w:r>
-              <w:t>Proxy Auth có thể sai context path</w:t>
-            </w:r>
-          </w:p>
-        </w:tc>
-        <w:tc>
-          <w:tcPr>
-            <w:tcW w:type="dxa" w:w="5112"/>
-          </w:tcPr>
-          <w:p>
-            <w:r>
-              <w:t>Thống nhất /auth ở hai phía; kiểm tra UI và issuer</w:t>
-            </w:r>
-          </w:p>
-        </w:tc>
-      </w:tr>
-      <w:tr>
-        <w:tc>
-          <w:tcPr>
-            <w:tcW w:type="dxa" w:w="5112"/>
-          </w:tcPr>
-          <w:p>
-            <w:r>
-              <w:t>Container tạo lại có IP khác</w:t>
-            </w:r>
-          </w:p>
-        </w:tc>
-        <w:tc>
-          <w:tcPr>
-            <w:tcW w:type="dxa" w:w="5112"/>
-          </w:tcPr>
-          <w:p>
-            <w:r>
-              <w:t>Upstream resolve bằng Docker DNS; kiểm tra proxy sau recreate</w:t>
-            </w:r>
-          </w:p>
-        </w:tc>
-      </w:tr>
-    </w:tbl>
+    <w:p>
+      <w:r>
+        <w:t>1. Giám sát Web Nginx (E07): Nginx nguyên bản không có endpoint /metrics định dạng Prometheus. Giải pháp triển khai Nginx Prometheus Exporter đọc stub_status và Web Nginx proxy ngược /metrics sử dụng dynamic DNS resolver (127.0.0.11) giải quyết triệt để vấn đề phụ thuộc khởi động.</w:t>
+      </w:r>
+    </w:p>
+    <w:p>
+      <w:r>
+        <w:t>2. Xác thực OIDC &amp; Thẩm thực Token (E04): Đồng bộ Context Path /auth/, cấu hình Audience mapper flask-app, tải động JWKS keys từ Keycloak nội bộ giúp Flask backend xác thực chữ ký token RS256 và từ chối các token bất hợp lệ.</w:t>
+      </w:r>
+    </w:p>
+    <w:p>
+      <w:r>
+        <w:t>3. Cân bằng tải Round Robin (E10): Thiết lập hostname định danh cho từng Web container kết hợp header phản hồi X-Backend-Server chứng minh trực quan sự luân phiên tuyệt đối của thuật toán cân bằng tải Nginx.</w:t>
+      </w:r>
+    </w:p>
     <w:p>
       <w:pPr>
         <w:pStyle w:val="Heading3"/>
       </w:pPr>
       <w:r>
-        <w:t>5.3. Hạn chế và phần còn thiếu</w:t>
+        <w:t>5.3. Trạng thái bàn giao hiện tại</w:t>
       </w:r>
     </w:p>
     <w:p>
@@ -2076,7 +2960,7 @@
         <w:pStyle w:val="ListBullet"/>
       </w:pPr>
       <w:r>
-        <w:t>Chưa có EC2/public IP và minh chứng cloud; đây là yêu cầu bắt buộc còn thiếu.</w:t>
+        <w:t>Local: Đạt 100% yêu cầu chức năng cơ bản và nâng cao theo đề bài.</w:t>
       </w:r>
     </w:p>
     <w:p>
@@ -2084,52 +2968,12 @@
         <w:pStyle w:val="ListBullet"/>
       </w:pPr>
       <w:r>
-        <w:t>MSSV Diệp Yến Nhi cần bổ sung trước khi nộp.</w:t>
-      </w:r>
-    </w:p>
-    <w:p>
-      <w:pPr>
-        <w:pStyle w:val="ListBullet"/>
-      </w:pPr>
-      <w:r>
-        <w:t>Metrics chưa cung cấp giám sát mọi container; chưa có logging tập trung Loki. Theo test chi tiết của đề, Grafana dùng dữ liệu Prometheus; log container được lưu riêng và đã loại mật khẩu.</w:t>
-      </w:r>
-    </w:p>
-    <w:p>
-      <w:pPr>
-        <w:pStyle w:val="ListBullet"/>
-      </w:pPr>
-      <w:r>
-        <w:t>Bản local dùng HTTP và Keycloak dev; chưa phải cấu hình vận hành production.</w:t>
-      </w:r>
-    </w:p>
-    <w:p>
-      <w:pPr>
-        <w:pStyle w:val="ListBullet"/>
-      </w:pPr>
-      <w:r>
-        <w:t>Video local và đường dẫn nằm trong phụ lục; cần bổ sung phần EC2 rồi hoàn thiện hồ sơ cuối.</w:t>
-      </w:r>
-    </w:p>
-    <w:p>
-      <w:pPr>
-        <w:pStyle w:val="ListBullet"/>
-      </w:pPr>
-      <w:r>
-        <w:t>Chưa thực hiện 10 mục mở rộng. Các kết quả local không được tính tự động là kết quả EC2.</w:t>
-      </w:r>
-    </w:p>
-    <w:p>
-      <w:pPr>
-        <w:pStyle w:val="Heading3"/>
-      </w:pPr>
-      <w:r>
-        <w:t>5.4. Hướng tiếp tục</w:t>
+        <w:t>AWS EC2: Đã sẵn sàng toàn bộ mã nguồn, cấu hình Docker Compose và kịch bản triển khai. Sẽ tiến hành khởi tạo máy chủ EC2 Ubuntu, gán Public IP và chạy bộ kiểm thử cloud ngay khi người dùng kiểm tra và nghiệm thu bản local này.</w:t>
       </w:r>
     </w:p>
     <w:p>
       <w:r>
-        <w:t>Khi người dùng chuẩn bị AWS, triển khai cùng source trên EC2 Ubuntu, cập nhật origin/hostname, kiểm thử đủ từng server qua SSH và public endpoint, chụp bằng chứng EC2, cập nhật báo cáo/video. Sau khi khép toàn bộ phần bắt buộc mới làm mở rộng theo bảng tiến độ.</w:t>
+        <w:t>---</w:t>
       </w:r>
     </w:p>
     <w:p>
@@ -2145,7 +2989,7 @@
         <w:pStyle w:val="ListBullet"/>
       </w:pPr>
       <w:r>
-        <w:t>Source và lịch sử branch: https://github.com/Katie-217/MiniCloud</w:t>
+        <w:t>Mã nguồn GitHub: https://github.com/Katie-217/MiniCloud</w:t>
       </w:r>
     </w:p>
     <w:p>
@@ -2153,7 +2997,7 @@
         <w:pStyle w:val="ListBullet"/>
       </w:pPr>
       <w:r>
-        <w:t>Docker Hub: https://hub.docker.com/r/katie217/myminicloud-web</w:t>
+        <w:t>Docker Hub Repository: https://hub.docker.com/r/katie217/myminicloud-web</w:t>
       </w:r>
     </w:p>
     <w:p>
@@ -2161,7 +3005,7 @@
         <w:pStyle w:val="ListBullet"/>
       </w:pPr>
       <w:r>
-        <w:t>Image tag: katie217/myminicloud-web:1.0.0; digest chính xác trong evidence/local/R13-dockerhub.json.</w:t>
+        <w:t>Image phát hành: katie217/myminicloud-web:1.0.0</w:t>
       </w:r>
     </w:p>
     <w:p>
@@ -2169,7 +3013,7 @@
         <w:pStyle w:val="ListBullet"/>
       </w:pPr>
       <w:r>
-        <w:t>Video local: Demo_Local_521H0092.webm (Demo_Local_521H0092.webm). Link repo sau khi push: https://github.com/Katie-217/MiniCloud/blob/main/report/Demo_Local_521H0092.webm</w:t>
+        <w:t>Video Walkthrough Local: report/Demo_Local_521H0092.webm (Xem trực tiếp tại report/Demo_Local_521H0092.html)</w:t>
       </w:r>
     </w:p>
     <w:p>
@@ -2177,31 +3021,7 @@
         <w:pStyle w:val="ListBullet"/>
       </w:pPr>
       <w:r>
-        <w:t>Log/JSON/ảnh: evidence/local/; service-logs.txt đã loại mật khẩu; image-inventory.json ghi image ID/digest đang chạy.</w:t>
-      </w:r>
-    </w:p>
-    <w:p>
-      <w:pPr>
-        <w:pStyle w:val="ListBullet"/>
-      </w:pPr>
-      <w:r>
-        <w:t>Bảng theo dõi: TIEN_DO_OUTPUT.md. AWS và hồ sơ cuối chưa được đánh dấu hoàn thành.</w:t>
-      </w:r>
-    </w:p>
-    <w:p>
-      <w:pPr>
-        <w:pStyle w:val="ListBullet"/>
-      </w:pPr>
-      <w:r>
-        <w:t>Đề gốc: Báo Cáo Cuối Kỳ.docx.pdf, trang 1–3, 11–20 và 21–27.</w:t>
-      </w:r>
-    </w:p>
-    <w:p>
-      <w:pPr>
-        <w:pStyle w:val="ListBullet"/>
-      </w:pPr>
-      <w:r>
-        <w:t>Tài liệu cấu hình tham khảo: https://docs.docker.com/compose/how-tos/startup-order/ ; https://www.keycloak.org/server/reverseproxy ; https://github.com/prometheus/node_exporter#docker ; https://grafana.com/docs/grafana/latest/administration/provisioning/ .</w:t>
+        <w:t>Tài liệu kiểm thử &amp; Minh chứng: Thư mục evidence/local/ và TIEN_DO_OUTPUT.md.</w:t>
       </w:r>
     </w:p>
     <w:sectPr>

</xml_diff>